<commit_message>
style(thesis): simplify Appendix A manual wording into natural, easy-to-understand student language
</commit_message>
<xml_diff>
--- a/Project/Appendix_A.docx
+++ b/Project/Appendix_A.docx
@@ -79,7 +79,7 @@
           <w:sz w:val="32"/>
           <w:rFonts w:ascii="TH Sarabun New" w:hAnsi="TH Sarabun New" w:cs="TH Sarabun New"/>
         </w:rPr>
-        <w:t>ส่วนของคู่มือการใช้งานระบบแชทบอทวิเคราะห์โรคข้าว แบ่งออกเป็น 2 ส่วน ประกอบด้วย</w:t>
+        <w:t>คู่มือการใช้งานระบบแชทบอทวิเคราะห์โรคข้าว แบ่งออกเป็น 2 ส่วน ดังนี้</w:t>
       </w:r>
     </w:p>
     <w:p>
@@ -97,7 +97,7 @@
           <w:sz w:val="32"/>
           <w:rFonts w:ascii="TH Sarabun New" w:hAnsi="TH Sarabun New" w:cs="TH Sarabun New"/>
         </w:rPr>
-        <w:t>1) ส่วนสำหรับผู้ใช้งานทั่วไป (เกษตรกร)</w:t>
+        <w:t>1) ส่วนสำหรับผู้ใช้งานทั่วไป (เกษตรกร): การใช้งานแชทบอทผ่านแอปพลิเคชัน LINE</w:t>
       </w:r>
     </w:p>
     <w:p>
@@ -115,7 +115,7 @@
           <w:sz w:val="32"/>
           <w:rFonts w:ascii="TH Sarabun New" w:hAnsi="TH Sarabun New" w:cs="TH Sarabun New"/>
         </w:rPr>
-        <w:t>2) ส่วนสำหรับผู้ดูแลระบบ (Admin)</w:t>
+        <w:t>2) ส่วนสำหรับผู้ดูแลระบบ (Admin): การจัดการระบบทำงานอัตโนมัติ (n8n) และฐานข้อมูลความรู้ (Pinecone)</w:t>
       </w:r>
     </w:p>
     <w:p>
@@ -150,7 +150,7 @@
           <w:sz w:val="32"/>
           <w:rFonts w:ascii="TH Sarabun New" w:hAnsi="TH Sarabun New" w:cs="TH Sarabun New"/>
         </w:rPr>
-        <w:t>ก.1.1 การเพิ่มเพื่อนและเริ่มต้นใช้งานแชทบอท (Add Friend)</w:t>
+        <w:t>ก.1.1 การเพิ่มเพื่อนและเริ่มต้นใช้งานแชทบอท</w:t>
       </w:r>
     </w:p>
     <w:p>
@@ -168,7 +168,7 @@
           <w:sz w:val="32"/>
           <w:rFonts w:ascii="TH Sarabun New" w:hAnsi="TH Sarabun New" w:cs="TH Sarabun New"/>
         </w:rPr>
-        <w:t>ผู้ใช้งานสามารถเริ่มต้นใช้งานระบบได้โดยการเพิ่มเพื่อนในแอปพลิเคชัน LINE ผ่าน 2 ช่องทาง ได้แก่ การสแกนรหัสคิวอาร์ (QR Code) ประจำบัญชีทางการ หรือค้นหาด้วย LINE ID (@บอทวินิจฉัยโรคข้าว) เมื่อทำการเพิ่มเพื่อนสำเร็จและเข้าสู่ห้องแชท ระบบจะส่งข้อความต้อนรับอัตโนมัติ (Greeting Message) เพื่อแนะนำตัวและสรุปฟังก์ชันการทำงานเบื้องต้น พร้อมทั้งแสดงแถบเมนูด้านล่าง (Rich Menu) เพื่อให้ผู้ใช้เลือกเข้าถึงคำสั่งต่าง ๆ ได้ทันที</w:t>
+        <w:t>ผู้ใช้สามารถเริ่มต้นใช้งานได้ง่าย ๆ โดยการเพิ่มเพื่อนใน LINE ผ่าน 2 วิธี ได้แก่ การสแกนคิวอาร์โค้ด (QR Code) ของแชทบอท หรือค้นหาด้วย LINE ID (@บอทวินิจฉัยโรคข้าว) เมื่อกดเพิ่มเพื่อนและเปิดเข้าไปในห้องแชท แชทบอทจะส่งข้อความทักทายต้อนรับ แนะนำตัว และบอกวิธีใช้งานเบื้องต้น พร้อมกับแสดงเมนูหลักที่ด้านล่างของหน้าจอทันที</w:t>
       </w:r>
     </w:p>
     <w:tbl>
@@ -249,7 +249,7 @@
           <w:sz w:val="32"/>
           <w:rFonts w:ascii="TH Sarabun New" w:hAnsi="TH Sarabun New" w:cs="TH Sarabun New"/>
         </w:rPr>
-        <w:t>การเพิ่มเพื่อนและข้อความต้อนรับเข้าสู่ระบบแชทบอท</w:t>
+        <w:t>การเพิ่มเพื่อนและข้อความต้อนรับของแชทบอท</w:t>
       </w:r>
     </w:p>
     <w:p>
@@ -266,7 +266,7 @@
           <w:sz w:val="28"/>
           <w:rFonts w:ascii="TH Sarabun New" w:hAnsi="TH Sarabun New" w:cs="TH Sarabun New"/>
         </w:rPr>
-        <w:t>(คำอธิบายรูป: ภาพหน้าจอแอปพลิเคชัน LINE ขณะเพิ่มเพื่อนสำเร็จ มีข้อความต้อนรับอัตโนมัติปรากฏขึ้น และมีแถบ Rich Menu แสดงอยู่ที่ด้านล่างของหน้าจอ)</w:t>
+        <w:t>(คำอธิบายรูป: หน้าจอ LINE ตอนกดเพิ่มเพื่อน และมีข้อความต้อนรับพร้อมเมนูด้านล่างปรากฏขึ้น)</w:t>
       </w:r>
     </w:p>
     <w:p>
@@ -302,7 +302,7 @@
           <w:sz w:val="32"/>
           <w:rFonts w:ascii="TH Sarabun New" w:hAnsi="TH Sarabun New" w:cs="TH Sarabun New"/>
         </w:rPr>
-        <w:t>แถบเมนูลัดที่ด้านล่างของหน้าจอห้องแชท (Rich Menu) ออกแบบมาเพื่อให้เกษตรกรสามารถกดใช้งานได้อย่างสะดวกรวดเร็ว โดยแบ่งออกเป็น 3 เมนูคำสั่งหลัก ได้แก่:</w:t>
+        <w:t>ที่แถบด้านล่างของหน้าจอแชทจะมีเมนูลัดให้กดใช้งานได้สะดวก แบ่งออกเป็น 3 ปุ่มหลัก ดังนี้:</w:t>
       </w:r>
     </w:p>
     <w:p>
@@ -320,7 +320,7 @@
           <w:sz w:val="32"/>
           <w:rFonts w:ascii="TH Sarabun New" w:hAnsi="TH Sarabun New" w:cs="TH Sarabun New"/>
         </w:rPr>
-        <w:t>1) ตรวจโรคข้าว: เมนูแนะนำการส่งภาพถ่ายใบข้าวเพื่อให้ระบบทำการวิเคราะห์</w:t>
+        <w:t>1) ตรวจโรคข้าว: แนะนำวิธีการส่งรูปถ่ายใบข้าวเพื่อให้บอทช่วยตรวจ</w:t>
       </w:r>
     </w:p>
     <w:p>
@@ -338,7 +338,7 @@
           <w:sz w:val="32"/>
           <w:rFonts w:ascii="TH Sarabun New" w:hAnsi="TH Sarabun New" w:cs="TH Sarabun New"/>
         </w:rPr>
-        <w:t>2) วิธีการใช้งาน: เมนูแสดงคำแนะนำขั้นตอนการถ่ายภาพใบข้าวที่ถูกต้อง และตัวอย่างคำถามที่สามารถสอบถามบอทได้</w:t>
+        <w:t>2) วิธีการใช้งาน: บอกขั้นตอนการถ่ายรูปใบข้าวให้ชัดเจน และตัวอย่างคำถามที่สามารถพิมพ์ถามบอทได้</w:t>
       </w:r>
     </w:p>
     <w:p>
@@ -356,7 +356,7 @@
           <w:sz w:val="32"/>
           <w:rFonts w:ascii="TH Sarabun New" w:hAnsi="TH Sarabun New" w:cs="TH Sarabun New"/>
         </w:rPr>
-        <w:t>3) เกี่ยวกับระบบ / ข้อมูลอ้างอิง: เมนูแสดงข้อมูลรายละเอียดของโครงงาน และแหล่งอ้างอิงองค์ความรู้จากกรมการข้าว กระทรวงเกษตรและสหกรณ์</w:t>
+        <w:t>3) เกี่ยวกับระบบ: แสดงข้อมูลเกี่ยวกับโครงงาน และหน่วยงานอ้างอิงข้อมูล (กรมการข้าว)</w:t>
       </w:r>
     </w:p>
     <w:tbl>
@@ -437,7 +437,7 @@
           <w:sz w:val="32"/>
           <w:rFonts w:ascii="TH Sarabun New" w:hAnsi="TH Sarabun New" w:cs="TH Sarabun New"/>
         </w:rPr>
-        <w:t>หน้าจอเมนูหลัก (Rich Menu) ที่แถบด้านล่างของห้องแชท LINE</w:t>
+        <w:t>หน้าจอเมนูหลักด้านล่าง (Rich Menu)</w:t>
       </w:r>
     </w:p>
     <w:p>
@@ -454,7 +454,7 @@
           <w:sz w:val="28"/>
           <w:rFonts w:ascii="TH Sarabun New" w:hAnsi="TH Sarabun New" w:cs="TH Sarabun New"/>
         </w:rPr>
-        <w:t>(คำอธิบายรูป: ภาพหน้าจอแสดงแถบ Rich Menu ด้านล่างของห้องแชท LINE ซึ่งประกอบด้วย 3 ปุ่มคำสั่ง: ตรวจโรคข้าว, วิธีการใช้งาน, และเกี่ยวกับระบบ)</w:t>
+        <w:t>(คำอธิบายรูป: หน้าจอ LINE แสดงปุ่มเมนูด้านล่าง 3 ปุ่ม ได้แก่ ตรวจโรคข้าว, วิธีการใช้งาน, และเกี่ยวกับระบบ)</w:t>
       </w:r>
     </w:p>
     <w:p>
@@ -472,7 +472,7 @@
           <w:sz w:val="32"/>
           <w:rFonts w:ascii="TH Sarabun New" w:hAnsi="TH Sarabun New" w:cs="TH Sarabun New"/>
         </w:rPr>
-        <w:t>ก.1.3 การส่งรูปภาพใบข้าวเพื่อตรวจวินิจฉัยโรค (Image Diagnosis)</w:t>
+        <w:t>ก.1.3 การส่งรูปภาพใบข้าวเพื่อตรวจโรค</w:t>
       </w:r>
     </w:p>
     <w:p>
@@ -490,7 +490,7 @@
           <w:sz w:val="32"/>
           <w:rFonts w:ascii="TH Sarabun New" w:hAnsi="TH Sarabun New" w:cs="TH Sarabun New"/>
         </w:rPr>
-        <w:t>เกษตรกรสามารถส่งภาพถ่ายใบข้าวที่มีอาการผิดปกติเพื่อตรวจวินิจฉัยได้ตามขั้นตอนดังนี้:</w:t>
+        <w:t>เมื่อพบใบข้าวที่มีอาการผิดปกติในแปลงนา สามารถส่งรูปให้บอทตรวจได้ตามขั้นตอนนี้:</w:t>
       </w:r>
     </w:p>
     <w:p>
@@ -508,7 +508,7 @@
           <w:sz w:val="32"/>
           <w:rFonts w:ascii="TH Sarabun New" w:hAnsi="TH Sarabun New" w:cs="TH Sarabun New"/>
         </w:rPr>
-        <w:t>1) กดที่ไอคอน “กล้องถ่ายรูป” เพื่อถ่ายภาพใบข้าวจากแปลงนาโดยตรง หรือกดไอคอน “รูปภาพ” เพื่อเลือกภาพที่ถ่ายเก็บไว้ในคลังภาพ</w:t>
+        <w:t>1) กดที่ไอคอน “กล้องถ่ายรูป” เพื่อถ่ายรูปใบข้าวในนาจริง หรือกดไอคอน “รูปภาพ” เพื่อเลือกรูปถ่ายที่มีอยู่ในเครื่อง</w:t>
       </w:r>
     </w:p>
     <w:p>
@@ -526,7 +526,7 @@
           <w:sz w:val="32"/>
           <w:rFonts w:ascii="TH Sarabun New" w:hAnsi="TH Sarabun New" w:cs="TH Sarabun New"/>
         </w:rPr>
-        <w:t>2) ข้อแนะนำในการถ่ายภาพ: ควรโฟกัสภาพถ่ายระยะใกล้ (Close-up) บริเวณรอยโรคบนแผ่นใบข้าว ให้เห็นแผลชัดเจน มีแสงสว่างเพียงพอ และหลีกเลี่ยงภาพเบลอหรือภาพมุมกว้างทั้งแปลงนา</w:t>
+        <w:t>2) คำแนะนำในการถ่ายรูป: ควรถ่ายรูปใบข้าวใกล้ ๆ (ระยะใกล้) ให้เห็นแผลหรือรอยโรคชัดเจน ให้ใบข้าวอยู่ตรงกลางภาพ มีแสงสว่างพอดี และหลีกเลี่ยงภาพเบลอ ภาพสั่น หรือภาพมุมกว้างทั้งแปลงนา</w:t>
       </w:r>
     </w:p>
     <w:p>
@@ -544,7 +544,7 @@
           <w:sz w:val="32"/>
           <w:rFonts w:ascii="TH Sarabun New" w:hAnsi="TH Sarabun New" w:cs="TH Sarabun New"/>
         </w:rPr>
-        <w:t>3) กดปุ่ม “ส่ง” (Send) เพื่อส่งภาพเข้าสู่ห้องแชท ระบบจะส่งข้อความแจ้งเตือนสถานะการประมวลผลให้ผู้ใช้ทราบว่าระบบกำลังวิเคราะห์ภาพ</w:t>
+        <w:t>3) กดปุ่ม “ส่ง” รูปภาพเข้าห้องแชท บอทจะส่งข้อความแจ้งว่ากำลังวิเคราะห์รูปภาพ ให้รอสักครู่</w:t>
       </w:r>
     </w:p>
     <w:tbl>
@@ -625,7 +625,7 @@
           <w:sz w:val="32"/>
           <w:rFonts w:ascii="TH Sarabun New" w:hAnsi="TH Sarabun New" w:cs="TH Sarabun New"/>
         </w:rPr>
-        <w:t>การเลือกและส่งรูปภาพใบข้าวที่มีรอยโรคเข้าสู่ห้องแชท LINE</w:t>
+        <w:t>การเลือกและส่งรูปภาพใบข้าวเข้าสู่ห้องแชท</w:t>
       </w:r>
     </w:p>
     <w:p>
@@ -642,7 +642,7 @@
           <w:sz w:val="28"/>
           <w:rFonts w:ascii="TH Sarabun New" w:hAnsi="TH Sarabun New" w:cs="TH Sarabun New"/>
         </w:rPr>
-        <w:t>(คำอธิบายรูป: ภาพหน้าจอขณะผู้ใช้เลือกภาพถ่ายใบข้าวที่มีอาการของโรคจากอัลบั้มหรือกล้อง และกดส่งเข้ามาในห้องแชท)</w:t>
+        <w:t>(คำอธิบายรูป: หน้าจอ LINE ตอนเลือกรูปถ่ายใบข้าวที่มีอาการผิดปกติและกดส่งเข้าไปในแชท)</w:t>
       </w:r>
     </w:p>
     <w:p>
@@ -660,7 +660,7 @@
           <w:sz w:val="32"/>
           <w:rFonts w:ascii="TH Sarabun New" w:hAnsi="TH Sarabun New" w:cs="TH Sarabun New"/>
         </w:rPr>
-        <w:t>ก.1.4 การรับผลการวินิจฉัยโรคและคำแนะนำการรักษา (Diagnosis &amp; Advisory Result)</w:t>
+        <w:t>ก.1.4 การรับผลการตรวจและวิธีรักษาโรค</w:t>
       </w:r>
     </w:p>
     <w:p>
@@ -678,7 +678,7 @@
           <w:sz w:val="32"/>
           <w:rFonts w:ascii="TH Sarabun New" w:hAnsi="TH Sarabun New" w:cs="TH Sarabun New"/>
         </w:rPr>
-        <w:t>เมื่อระบบประมวลผลเสร็จสิ้น แชทบอทจะส่งข้อความตอบกลับในรูปแบบข้อความตัวหนังสือที่มีโครงสร้างชัดเจนและอ่านง่าย ประกอบด้วยข้อมูล 3 ส่วนสำคัญ ได้แก่:</w:t>
+        <w:t>เมื่อบอทวิเคราะห์รูปภาพเสร็จแล้ว จะส่งข้อความบอกรายละเอียดกลับมา 3 ส่วน ดังนี้:</w:t>
       </w:r>
     </w:p>
     <w:p>
@@ -696,7 +696,7 @@
           <w:sz w:val="32"/>
           <w:rFonts w:ascii="TH Sarabun New" w:hAnsi="TH Sarabun New" w:cs="TH Sarabun New"/>
         </w:rPr>
-        <w:t>1) ผลการวินิจฉัยโรค: แสดงชื่อโรคข้าวที่ตรวจพบ (ทั้งภาษาไทยและภาษาอังกฤษ เช่น โรคไหม้ข้าว / Rice Blast) พร้อมระบุระดับความเชื่อมั่นของโมเดล (Confidence Score คิดเป็นเปอร์เซ็นต์)</w:t>
+        <w:t>1) ผลการตรวจวินิจฉัย: บอกชื่อโรคข้าวที่ตรวจพบ (ทั้งภาษาไทยและภาษาอังกฤษ เช่น โรคไหม้ข้าว / Rice Blast) พร้อมบอกระดับความมั่นใจของระบบเป็นเปอร์เซ็นต์</w:t>
       </w:r>
     </w:p>
     <w:p>
@@ -714,7 +714,7 @@
           <w:sz w:val="32"/>
           <w:rFonts w:ascii="TH Sarabun New" w:hAnsi="TH Sarabun New" w:cs="TH Sarabun New"/>
         </w:rPr>
-        <w:t>2) สาเหตุและลักษณะอาการ: อธิบายสาเหตุของโรค (เชื้อราหรือแบคทีเรีย) และลักษณะแผลที่สังเกตได้บนแผ่นใบ</w:t>
+        <w:t>2) สาเหตุและอาการของโรค: อธิบายว่าโรคเกิดจากเชื้อราหรือแบคทีเรีย และมีลักษณะแผลบนใบอย่างไร</w:t>
       </w:r>
     </w:p>
     <w:p>
@@ -732,7 +732,7 @@
           <w:sz w:val="32"/>
           <w:rFonts w:ascii="TH Sarabun New" w:hAnsi="TH Sarabun New" w:cs="TH Sarabun New"/>
         </w:rPr>
-        <w:t>3) แนวทางการจัดการและรักษา: คำแนะนำการปฏิบัติตามหลักวิชาการของกรมการข้าว เช่น การควบคุมระดับน้ำในนา, การงดใส่ปุ๋ยไนโตรเจนชั่วคราว, ชนิดของสารชีวภัณฑ์หรือสารเคมีที่แนะนำ พร้อมอัตราการผสมฉีดพ่นที่ถูกต้องและปลอดภัย</w:t>
+        <w:t>3) วิธีรักษาและการดูแล: แนะนำวิธีจัดการแปลงนา และชนิดของยาหรือสารชีวภัณฑ์ที่แนะนำให้ใช้ พร้อมอัตราการผสมฉีดพ่นตามคู่มือของกรมการข้าว</w:t>
       </w:r>
     </w:p>
     <w:tbl>
@@ -813,7 +813,7 @@
           <w:sz w:val="32"/>
           <w:rFonts w:ascii="TH Sarabun New" w:hAnsi="TH Sarabun New" w:cs="TH Sarabun New"/>
         </w:rPr>
-        <w:t>ผลการวินิจฉัยโรคข้าวและคำแนะนำการรักษาที่บอทส่งตอบกลับผู้ใช้</w:t>
+        <w:t>ข้อความผลการวินิจฉัยโรคและคำแนะนำการรักษา</w:t>
       </w:r>
     </w:p>
     <w:p>
@@ -830,7 +830,7 @@
           <w:sz w:val="28"/>
           <w:rFonts w:ascii="TH Sarabun New" w:hAnsi="TH Sarabun New" w:cs="TH Sarabun New"/>
         </w:rPr>
-        <w:t>(คำอธิบายรูป: ภาพหน้าจอข้อความผลลัพธ์ที่แชทบอทส่งกลับมา แสดงชื่อโรค ค่าความเชื่อมั่น สาเหตุของโรค และวิธีการรักษาจากคู่มือกรมการข้าว)</w:t>
+        <w:t>(คำอธิบายรูป: หน้าจอแสดงข้อความที่แชทบอทตอบกลับ บอกชื่อโรค เปอร์เซ็นต์ความมั่นใจ สาเหตุ และวิธีรักษา)</w:t>
       </w:r>
     </w:p>
     <w:p>
@@ -848,7 +848,7 @@
           <w:sz w:val="32"/>
           <w:rFonts w:ascii="TH Sarabun New" w:hAnsi="TH Sarabun New" w:cs="TH Sarabun New"/>
         </w:rPr>
-        <w:t>ก.1.5 การพิมพ์ข้อความสอบถามข้อมูลโรคข้าวเพิ่มเติม (Text Query / Conversational Q&amp;A)</w:t>
+        <w:t>ก.1.5 การพิมพ์ข้อความสอบถามข้อมูลโรคข้าว</w:t>
       </w:r>
     </w:p>
     <w:p>
@@ -866,7 +866,7 @@
           <w:sz w:val="32"/>
           <w:rFonts w:ascii="TH Sarabun New" w:hAnsi="TH Sarabun New" w:cs="TH Sarabun New"/>
         </w:rPr>
-        <w:t>นอกจากการส่งภาพแล้ว ผู้ใช้งานสามารถพิมพ์ข้อความสอบถามข้อสงสัยเกี่ยวกับโรคข้าว การดูแลรักษา หรือการใช้ยาได้โดยตรง เช่น “โรคขอบใบแห้งเกิดจากอะไร”, “ถ้าข้าวเป็นโรคไหม้ต้องใช้ยาตัวไหนฉีด”, หรือ “โรคใบจุดสีน้ำตาลป้องกันยังไง” ระบบสืบค้นข้อมูลความรู้ (RAG) จะค้นหาข้อมูลที่ตรงจุดจากฐานข้อมูลวิชาการของกรมการข้าว และใช้ปัญญาประดิษฐ์เรียบเรียงคำตอบเป็นภาษาธรรมชาติที่กระชับและเข้าใจง่ายตอบกลับผู้ใช้ทันที</w:t>
+        <w:t>นอกจากส่งรูปภาพแล้ว ผู้ใช้ยังสามารถพิมพ์ข้อความถามข้อสงสัยเกี่ยวกับโรคข้าวหรือการดูแลรักษาได้เลย เช่น “โรคขอบใบแห้งเกิดจากอะไร”, “ถ้าข้าวเป็นโรคไหม้ต้องใช้ยาตัวไหนฉีด”, หรือ “โรคใบจุดสีน้ำตาลมีวิธีป้องกันยังไง” บอทจะค้นหาข้อมูลจากคู่มือวิชาการของกรมการข้าว แล้วสรุปคำตอบที่เข้าใจง่ายและตรงจุดส่งกลับมาให้ทันที</w:t>
       </w:r>
     </w:p>
     <w:tbl>
@@ -947,7 +947,7 @@
           <w:sz w:val="32"/>
           <w:rFonts w:ascii="TH Sarabun New" w:hAnsi="TH Sarabun New" w:cs="TH Sarabun New"/>
         </w:rPr>
-        <w:t>การพิมพ์ข้อความสอบถามข้อมูลโรคข้าวและคำตอบจากระบบ</w:t>
+        <w:t>การพิมพ์ข้อความสอบถามข้อมูลโรคข้าว</w:t>
       </w:r>
     </w:p>
     <w:p>
@@ -964,7 +964,7 @@
           <w:sz w:val="28"/>
           <w:rFonts w:ascii="TH Sarabun New" w:hAnsi="TH Sarabun New" w:cs="TH Sarabun New"/>
         </w:rPr>
-        <w:t>(คำอธิบายรูป: ภาพหน้าจอการสนทนาที่ผู้ใช้พิมพ์คำถามเกี่ยวกับโรคข้าวหรือการใช้ยา และแชทบอทตอบกลับด้วยคำแนะนำที่ถูกต้องตามหลักวิชาการ)</w:t>
+        <w:t>(คำอธิบายรูป: หน้าจอตอนพิมพ์ถามข้อสงสัยเรื่องโรคข้าว และบอทตอบคำแนะนำกลับมา)</w:t>
       </w:r>
     </w:p>
     <w:p>
@@ -982,7 +982,7 @@
           <w:sz w:val="32"/>
           <w:rFonts w:ascii="TH Sarabun New" w:hAnsi="TH Sarabun New" w:cs="TH Sarabun New"/>
         </w:rPr>
-        <w:t>ก.1.6 การแจ้งเตือนกรณีภาพถ่ายไม่ชัดเจนหรืออยู่นอกขอบเขต (Fallback &amp; Guardrails)</w:t>
+        <w:t>ก.1.6 การแจ้งเตือนกรณีส่งรูปไม่ชัดเจนหรือถามนอกเรื่อง</w:t>
       </w:r>
     </w:p>
     <w:p>
@@ -1000,7 +1000,7 @@
           <w:sz w:val="32"/>
           <w:rFonts w:ascii="TH Sarabun New" w:hAnsi="TH Sarabun New" w:cs="TH Sarabun New"/>
         </w:rPr>
-        <w:t>ระบบมีกลไกป้องกันความผิดพลาดเพื่อความปลอดภัยของเกษตรกร โดยแบ่งเป็น 2 กรณี:</w:t>
+        <w:t>ระบบมีการแจ้งเตือนเพื่อช่วยแนะนำผู้ใช้งานในกรณีต่าง ๆ ดังนี้:</w:t>
       </w:r>
     </w:p>
     <w:p>
@@ -1018,7 +1018,7 @@
           <w:sz w:val="32"/>
           <w:rFonts w:ascii="TH Sarabun New" w:hAnsi="TH Sarabun New" w:cs="TH Sarabun New"/>
         </w:rPr>
-        <w:t>1) กรณีส่งภาพที่ไม่ใช่ใบข้าว หรือภาพที่ตรวจไม่พบรอยโรค: ระบบจะตอบกลับอย่างสุภาพว่า “ระบบตรวจไม่พบรอยโรคข้าวในภาพ กรุณาถ่ายภาพใบข้าวที่มีรอยโรคให้ชัดเจนในระยะใกล้และส่งใหม่อีกครั้ง”</w:t>
+        <w:t>1) ถ้าส่งรูปอื่นที่ไม่ใช่ใบข้าว หรือภาพมองไม่เห็นรอยโรค: บอทจะตอบว่า “ตรวจไม่พบรอยโรคข้าวในภาพ กรุณาถ่ายภาพใบข้าวที่มีรอยโรคให้ชัดเจนในระยะใกล้แล้วส่งใหม่อีกครั้ง”</w:t>
       </w:r>
     </w:p>
     <w:p>
@@ -1036,7 +1036,7 @@
           <w:sz w:val="32"/>
           <w:rFonts w:ascii="TH Sarabun New" w:hAnsi="TH Sarabun New" w:cs="TH Sarabun New"/>
         </w:rPr>
-        <w:t>2) กรณีพิมพ์คำถามที่ไม่เกี่ยวข้องกับโรคข้าว: เช่น ถามสภาพอากาศ ราคาทองคำ หรือถามเรื่องพืชชนิดอื่น ระบบ Guardrail จะตอบปฏิเสธอย่างสุภาพว่า ระบบนี้เป็น AI ผู้ช่วยวินิจฉัยและให้คำปรึกษาเฉพาะเรื่องโรคข้าว จึงไม่สามารถตอบคำถามนอกขอบเขตได้</w:t>
+        <w:t>2) ถ้าพิมพ์ถามเรื่องอื่นที่ไม่เกี่ยวกับข้าว: เช่น ถามสภาพอากาศ ราคาทอง หรือถามเรื่องพืชชนิดอื่น บอทจะแจ้งอย่างสุภาพว่า ระบบนี้เชี่ยวชาญเฉพาะเรื่องโรคข้าว จึงไม่สามารถตอบเรื่องอื่นได้</w:t>
       </w:r>
     </w:p>
     <w:tbl>
@@ -1117,7 +1117,7 @@
           <w:sz w:val="32"/>
           <w:rFonts w:ascii="TH Sarabun New" w:hAnsi="TH Sarabun New" w:cs="TH Sarabun New"/>
         </w:rPr>
-        <w:t>การแจ้งเตือนกรณีส่งภาพที่ไม่ใช่ใบข้าวหรือคำถามนอกขอบเขต</w:t>
+        <w:t>การแจ้งเตือนเมื่อส่งภาพที่ไม่ใช่ใบข้าวหรือถามนอกเรื่อง</w:t>
       </w:r>
     </w:p>
     <w:p>
@@ -1134,7 +1134,7 @@
           <w:sz w:val="28"/>
           <w:rFonts w:ascii="TH Sarabun New" w:hAnsi="TH Sarabun New" w:cs="TH Sarabun New"/>
         </w:rPr>
-        <w:t>(คำอธิบายรูป: ภาพหน้าจอแสดงข้อความปฏิเสธอย่างสุภาพของแชทบอทเมื่อผู้ใช้ส่งภาพวัตถุอื่นหรือพิมพ์คำถามที่ไม่เกี่ยวข้องกับเรื่องโรคข้าว)</w:t>
+        <w:t>(คำอธิบายรูป: หน้าจอแชทบอทตอบแจ้งเตือนเมื่อตรวจไม่พบโรคข้าว หรือพิมพ์ถามเรื่องที่ไม่เกี่ยวข้อง)</w:t>
       </w:r>
     </w:p>
     <w:p>
@@ -1169,7 +1169,7 @@
           <w:sz w:val="32"/>
           <w:rFonts w:ascii="TH Sarabun New" w:hAnsi="TH Sarabun New" w:cs="TH Sarabun New"/>
         </w:rPr>
-        <w:t>ก.2.1 การเข้าสู่ระบบจัดการเวิร์กโฟลว์ (n8n Workflow Automation)</w:t>
+        <w:t>ก.2.1 การเข้าสู่ระบบจัดการ (n8n Login)</w:t>
       </w:r>
     </w:p>
     <w:p>
@@ -1187,7 +1187,7 @@
           <w:sz w:val="32"/>
           <w:rFonts w:ascii="TH Sarabun New" w:hAnsi="TH Sarabun New" w:cs="TH Sarabun New"/>
         </w:rPr>
-        <w:t>ผู้ดูแลระบบสามารถเข้าจัดการระบบควบคุมการทำงานอัตโนมัติได้ตามขั้นตอนดังนี้:</w:t>
+        <w:t>ผู้ดูแลระบบสามารถเข้าใช้งานระบบควบคุมการทำงานอัตโนมัติได้ดังนี้:</w:t>
       </w:r>
     </w:p>
     <w:p>
@@ -1205,7 +1205,7 @@
           <w:sz w:val="32"/>
           <w:rFonts w:ascii="TH Sarabun New" w:hAnsi="TH Sarabun New" w:cs="TH Sarabun New"/>
         </w:rPr>
-        <w:t>1) เปิดโปรแกรมเว็บเบราว์เซอร์ (เช่น Google Chrome) แล้วพิมพ์ URL ของระบบ n8n (เช่น http://localhost:5678 หรือ URL ประจำเซิร์ฟเวอร์)</w:t>
+        <w:t>1) เปิดเว็บเบราว์เซอร์ (เช่น Google Chrome) แล้วพิมพ์ลิงก์ของระบบ n8n (เช่น http://localhost:5678 หรือลิงก์ประจำเซิร์ฟเวอร์)</w:t>
       </w:r>
     </w:p>
     <w:p>
@@ -1223,7 +1223,7 @@
           <w:sz w:val="32"/>
           <w:rFonts w:ascii="TH Sarabun New" w:hAnsi="TH Sarabun New" w:cs="TH Sarabun New"/>
         </w:rPr>
-        <w:t>2) กรอก Email และ Password ของบัญชีผู้ดูแลระบบ</w:t>
+        <w:t>2) กรอก Email และ Password ของผู้ดูแลระบบ</w:t>
       </w:r>
     </w:p>
     <w:p>
@@ -1241,7 +1241,7 @@
           <w:sz w:val="32"/>
           <w:rFonts w:ascii="TH Sarabun New" w:hAnsi="TH Sarabun New" w:cs="TH Sarabun New"/>
         </w:rPr>
-        <w:t>3) กดปุ่ม “Sign in” เพื่อเข้าสู่หน้าแดชบอร์ดหลักของ n8n</w:t>
+        <w:t>3) กดปุ่ม “Sign in” เพื่อเข้าสู่หน้าแดชบอร์ด</w:t>
       </w:r>
     </w:p>
     <w:tbl>
@@ -1322,7 +1322,7 @@
           <w:sz w:val="32"/>
           <w:rFonts w:ascii="TH Sarabun New" w:hAnsi="TH Sarabun New" w:cs="TH Sarabun New"/>
         </w:rPr>
-        <w:t>หน้าจอเข้าสู่ระบบ (Sign In) ของระบบ n8n Workflow Automation</w:t>
+        <w:t>หน้าจอเข้าสู่ระบบจัดการ (n8n Login)</w:t>
       </w:r>
     </w:p>
     <w:p>
@@ -1339,7 +1339,7 @@
           <w:sz w:val="28"/>
           <w:rFonts w:ascii="TH Sarabun New" w:hAnsi="TH Sarabun New" w:cs="TH Sarabun New"/>
         </w:rPr>
-        <w:t>(คำอธิบายรูป: ภาพหน้าจอ Login ของ n8n สำหรับให้ผู้ดูแลระบบกรอกอีเมลและรหัสผ่านเพื่อเข้าใช้งาน)</w:t>
+        <w:t>(คำอธิบายรูป: หน้าจอเข้าสู่ระบบ n8n สำหรับกรอกอีเมลและรหัสผ่านของผู้ดูแลระบบ)</w:t>
       </w:r>
     </w:p>
     <w:p>
@@ -1357,7 +1357,7 @@
           <w:sz w:val="32"/>
           <w:rFonts w:ascii="TH Sarabun New" w:hAnsi="TH Sarabun New" w:cs="TH Sarabun New"/>
         </w:rPr>
-        <w:t>ก.2.2 การตรวจสอบผังการทำงานและการเชื่อมต่อระบบ (Workflow Canvas Overview)</w:t>
+        <w:t>ก.2.2 การตรวจสอบผังการทำงานของระบบ (Workflow Canvas)</w:t>
       </w:r>
     </w:p>
     <w:p>
@@ -1375,7 +1375,7 @@
           <w:sz w:val="32"/>
           <w:rFonts w:ascii="TH Sarabun New" w:hAnsi="TH Sarabun New" w:cs="TH Sarabun New"/>
         </w:rPr>
-        <w:t>เมื่อเข้าสู่ระบบ ผู้ดูแลระบบสามารถตรวจสอบและจัดการผังเวิร์กโฟลว์การทำงานของระบบแชทบอทได้ดังนี้:</w:t>
+        <w:t>เมื่อเข้าสู่ระบบแล้ว ให้เลือกเวิร์กโฟลว์ “Rice Leaf Disease Diagnosis Bot” หน้าจอจะแสดงขั้นตอนการทำงานของระบบที่เชื่อมต่อกันเป็นผังงาน (Canvas) ได้แก่:</w:t>
       </w:r>
     </w:p>
     <w:p>
@@ -1393,7 +1393,7 @@
           <w:sz w:val="32"/>
           <w:rFonts w:ascii="TH Sarabun New" w:hAnsi="TH Sarabun New" w:cs="TH Sarabun New"/>
         </w:rPr>
-        <w:t>1) เลือกเวิร์กโฟลว์โครงงาน “Rice Leaf Disease Diagnosis Bot”</w:t>
+        <w:t>1) โหนดรับข้อมูลจาก LINE (LINE Webhook): ทำหน้าที่รับรูปภาพและข้อความที่ผู้ใช้ส่งเข้ามา</w:t>
       </w:r>
     </w:p>
     <w:p>
@@ -1411,7 +1411,61 @@
           <w:sz w:val="32"/>
           <w:rFonts w:ascii="TH Sarabun New" w:hAnsi="TH Sarabun New" w:cs="TH Sarabun New"/>
         </w:rPr>
-        <w:t>2) หน้าจอจะแสดงผังการเชื่อมต่อโหนดต่าง ๆ (Canvas) ได้แก่ LINE Webhook Node, Router Node, HTTP Request Node (Model API), Pinecone Vector Search Node, Google Gemini 2.5 Flash Node, และ LINE Reply Node</w:t>
+        <w:t>2) โหนดแยกประเภท (Router): คัดแยกว่าเป็นรูปภาพหรือข้อความ</w:t>
+      </w:r>
+    </w:p>
+    <w:p>
+      <w:pPr>
+        <w:spacing w:line="276" w:lineRule="auto" w:before="0" w:after="40"/>
+        <w:ind w:firstLine="1080"/>
+        <w:jc w:val="left"/>
+      </w:pPr>
+      <w:r>
+        <w:rPr>
+          <w:rFonts w:ascii="TH Sarabun New" w:hAnsi="TH Sarabun New"/>
+          <w:b w:val="0"/>
+          <w:i w:val="0"/>
+          <w:color w:val="000000"/>
+          <w:sz w:val="32"/>
+          <w:rFonts w:ascii="TH Sarabun New" w:hAnsi="TH Sarabun New" w:cs="TH Sarabun New"/>
+        </w:rPr>
+        <w:t>3) โหนดเรียกโมเดล AI (Model API): ส่งรูปไปให้โมเดลตรวจจับโรคข้าว</w:t>
+      </w:r>
+    </w:p>
+    <w:p>
+      <w:pPr>
+        <w:spacing w:line="276" w:lineRule="auto" w:before="0" w:after="40"/>
+        <w:ind w:firstLine="1080"/>
+        <w:jc w:val="left"/>
+      </w:pPr>
+      <w:r>
+        <w:rPr>
+          <w:rFonts w:ascii="TH Sarabun New" w:hAnsi="TH Sarabun New"/>
+          <w:b w:val="0"/>
+          <w:i w:val="0"/>
+          <w:color w:val="000000"/>
+          <w:sz w:val="32"/>
+          <w:rFonts w:ascii="TH Sarabun New" w:hAnsi="TH Sarabun New" w:cs="TH Sarabun New"/>
+        </w:rPr>
+        <w:t>4) โหนดค้นหาข้อมูล (Pinecone Vector Search): ค้นหาวิธีรักษาโรคข้าวจากฐานข้อมูล</w:t>
+      </w:r>
+    </w:p>
+    <w:p>
+      <w:pPr>
+        <w:spacing w:line="276" w:lineRule="auto" w:before="0" w:after="40"/>
+        <w:ind w:firstLine="1080"/>
+        <w:jc w:val="left"/>
+      </w:pPr>
+      <w:r>
+        <w:rPr>
+          <w:rFonts w:ascii="TH Sarabun New" w:hAnsi="TH Sarabun New"/>
+          <w:b w:val="0"/>
+          <w:i w:val="0"/>
+          <w:color w:val="000000"/>
+          <w:sz w:val="32"/>
+          <w:rFonts w:ascii="TH Sarabun New" w:hAnsi="TH Sarabun New" w:cs="TH Sarabun New"/>
+        </w:rPr>
+        <w:t>5) โหนดสร้างคำตอบ (Google Gemini): เรียบเรียงคำแนะนำให้อ่านเข้าใจง่าย</w:t>
       </w:r>
     </w:p>
     <w:p>
@@ -1429,7 +1483,7 @@
           <w:sz w:val="32"/>
           <w:rFonts w:ascii="TH Sarabun New" w:hAnsi="TH Sarabun New" w:cs="TH Sarabun New"/>
         </w:rPr>
-        <w:t>3) ตรวจสอบสถานะการเปิดใช้งานเวิร์กโฟลว์ โดยปุ่มสวิตช์มุมขวาบนต้องอยู่ในสถานะ “Active” เพื่อให้ระบบทำงานได้ตลอดเวลา</w:t>
+        <w:t>6) โหนดส่งข้อความตอบกลับ (LINE Reply): ส่งผลลัพธ์กลับไปที่แชทของผู้ใช้ (หมายเหตุ: ต้องตรวจดูสวิตช์มุมขวาบนให้เปิดเป็น “Active” เพื่อให้ระบบทำงานตลอดเวลา)</w:t>
       </w:r>
     </w:p>
     <w:tbl>
@@ -1510,7 +1564,7 @@
           <w:sz w:val="32"/>
           <w:rFonts w:ascii="TH Sarabun New" w:hAnsi="TH Sarabun New" w:cs="TH Sarabun New"/>
         </w:rPr>
-        <w:t>ผังการทำงานภาพรวม (Workflow Canvas) บนระบบ n8n</w:t>
+        <w:t>หน้าจอผังการทำงานของแชทบอทบน n8n</w:t>
       </w:r>
     </w:p>
     <w:p>
@@ -1527,7 +1581,7 @@
           <w:sz w:val="28"/>
           <w:rFonts w:ascii="TH Sarabun New" w:hAnsi="TH Sarabun New" w:cs="TH Sarabun New"/>
         </w:rPr>
-        <w:t>(คำอธิบายรูป: ภาพหน้าจอผังการเชื่อมต่อโหนดต่าง ๆ บน n8n แสดงเส้นทางการรับส่งข้อมูลตั้งแต่ Webhook จนถึงการส่งข้อความตอบกลับ)</w:t>
+        <w:t>(คำอธิบายรูป: หน้าจอแสดงโหนดการทำงานต่าง ๆ ของระบบแชทบอทที่เชื่อมต่อกันบน n8n)</w:t>
       </w:r>
     </w:p>
     <w:p>
@@ -1545,7 +1599,7 @@
           <w:sz w:val="32"/>
           <w:rFonts w:ascii="TH Sarabun New" w:hAnsi="TH Sarabun New" w:cs="TH Sarabun New"/>
         </w:rPr>
-        <w:t>ก.2.3 การตรวจสอบประวัติการทำงานและข้อผิดพลาด (Execution Logs)</w:t>
+        <w:t>ก.2.3 การดูประวัติการใช้งานและข้อผิดพลาด (Execution Logs)</w:t>
       </w:r>
     </w:p>
     <w:p>
@@ -1563,7 +1617,7 @@
           <w:sz w:val="32"/>
           <w:rFonts w:ascii="TH Sarabun New" w:hAnsi="TH Sarabun New" w:cs="TH Sarabun New"/>
         </w:rPr>
-        <w:t>ผู้ดูแลระบบสามารถตรวจสอบสถานะการทำงานย้อนหลังและการวิเคราะห์ปัญหา (Debugging) ได้ดังนี้:</w:t>
+        <w:t>ผู้ดูแลระบบสามารถตรวจสอบการทำงานย้อนหลังของบอทได้ดังนี้:</w:t>
       </w:r>
     </w:p>
     <w:p>
@@ -1581,7 +1635,7 @@
           <w:sz w:val="32"/>
           <w:rFonts w:ascii="TH Sarabun New" w:hAnsi="TH Sarabun New" w:cs="TH Sarabun New"/>
         </w:rPr>
-        <w:t>1) คลิกที่แถบเมนู “Executions” ทางแถบด้านซ้ายของหน้าจอ</w:t>
+        <w:t>1) คลิกที่เมนู “Executions” ทางแถบด้านซ้าย</w:t>
       </w:r>
     </w:p>
     <w:p>
@@ -1599,7 +1653,7 @@
           <w:sz w:val="32"/>
           <w:rFonts w:ascii="TH Sarabun New" w:hAnsi="TH Sarabun New" w:cs="TH Sarabun New"/>
         </w:rPr>
-        <w:t>2) ระบบจะแสดงตารางรายการประวัติการเรียกใช้งานทั้งหมด พร้อมแสดงสถานะการทำงาน (Success / Error), เวลาที่เริ่มต้นทำงาน (Start time), และระยะเวลาที่ใช้ในการประมวลผล (Duration)</w:t>
+        <w:t>2) หน้าจอจะแสดงรายการที่เคยประมวลผลทั้งหมด พร้อมบอกเวลา สถานะว่าผ่านหรือไม่ (Success หรือ Error) และเวลาที่ใช้ไป</w:t>
       </w:r>
     </w:p>
     <w:p>
@@ -1617,7 +1671,7 @@
           <w:sz w:val="32"/>
           <w:rFonts w:ascii="TH Sarabun New" w:hAnsi="TH Sarabun New" w:cs="TH Sarabun New"/>
         </w:rPr>
-        <w:t>3) เมื่อคลิกที่รายการใดรายการหนึ่ง หน้าจอจะแสดงรายละเอียดข้อมูลนำเข้าและส่งออก (Input / Output Payload) ของแต่ละโหนดอย่างละเอียด ทำให้ผู้ดูแลระบบสามารถตรวจสอบได้ทันทีว่าเกิดปัญหาที่ขั้นตอนใด</w:t>
+        <w:t>3) สามารถคลิกเข้าไปดูรายละเอียดของแต่ละรายการได้ว่า ผู้ใช้ส่งภาพหรือข้อความอะไรเข้ามา และแต่ละขั้นตอนประมวลผลได้ผลลัพธ์อย่างไร ช่วยให้ตรวจสอบและแก้ไขปัญหาได้ง่าย</w:t>
       </w:r>
     </w:p>
     <w:tbl>
@@ -1698,7 +1752,7 @@
           <w:sz w:val="32"/>
           <w:rFonts w:ascii="TH Sarabun New" w:hAnsi="TH Sarabun New" w:cs="TH Sarabun New"/>
         </w:rPr>
-        <w:t>หน้าจอแสดงรายการประวัติการทำงาน (Execution Logs) บนระบบ n8n</w:t>
+        <w:t>หน้าจอแสดงประวัติการทำงาน (Executions) บน n8n</w:t>
       </w:r>
     </w:p>
     <w:p>
@@ -1715,7 +1769,7 @@
           <w:sz w:val="28"/>
           <w:rFonts w:ascii="TH Sarabun New" w:hAnsi="TH Sarabun New" w:cs="TH Sarabun New"/>
         </w:rPr>
-        <w:t>(คำอธิบายรูป: ภาพหน้าจอแสดงประวัติการทำงานย้อนหลังในหน้า Executions และการคลิกดูรายละเอียด Payload ของแต่ละโหนด)</w:t>
+        <w:t>(คำอธิบายรูป: หน้าจอแสดงรายการประวัติการใช้งานย้อนหลัง และการกดดูข้อมูลในแต่ละโหนด)</w:t>
       </w:r>
     </w:p>
     <w:p>
@@ -1733,7 +1787,7 @@
           <w:sz w:val="32"/>
           <w:rFonts w:ascii="TH Sarabun New" w:hAnsi="TH Sarabun New" w:cs="TH Sarabun New"/>
         </w:rPr>
-        <w:t>ก.2.4 การจัดการฐานข้อมูลความรู้เวกเตอร์ (Pinecone Vector Database)</w:t>
+        <w:t>ก.2.4 การจัดการฐานข้อมูลความรู้ (Pinecone Vector Database)</w:t>
       </w:r>
     </w:p>
     <w:p>
@@ -1751,7 +1805,7 @@
           <w:sz w:val="32"/>
           <w:rFonts w:ascii="TH Sarabun New" w:hAnsi="TH Sarabun New" w:cs="TH Sarabun New"/>
         </w:rPr>
-        <w:t>ผู้ดูแลระบบสามารถตรวจสอบและจัดการดัชนีข้อมูลความรู้ (Vector Index) ได้ดังนี้:</w:t>
+        <w:t>ผู้ดูแลระบบสามารถตรวจดูฐานข้อมูลความรู้โรคข้าวได้ตามขั้นตอนนี้:</w:t>
       </w:r>
     </w:p>
     <w:p>
@@ -1769,7 +1823,7 @@
           <w:sz w:val="32"/>
           <w:rFonts w:ascii="TH Sarabun New" w:hAnsi="TH Sarabun New" w:cs="TH Sarabun New"/>
         </w:rPr>
-        <w:t>1) เข้าสู่เว็บไซต์คอนโซลของ Pinecone (https://app.pinecone.io) และลงชื่อเข้าใช้</w:t>
+        <w:t>1) เข้าไปที่เว็บไซต์ Pinecone (https://app.pinecone.io) และลงชื่อเข้าใช้</w:t>
       </w:r>
     </w:p>
     <w:p>
@@ -1787,7 +1841,7 @@
           <w:sz w:val="32"/>
           <w:rFonts w:ascii="TH Sarabun New" w:hAnsi="TH Sarabun New" w:cs="TH Sarabun New"/>
         </w:rPr>
-        <w:t>2) เลือกดูรายละเอียด Index ประจำโครงงาน เช่น rice-disease-index</w:t>
+        <w:t>2) เลือกดู Index ประจำโครงงาน เช่น rice-disease-index</w:t>
       </w:r>
     </w:p>
     <w:p>
@@ -1805,7 +1859,7 @@
           <w:sz w:val="32"/>
           <w:rFonts w:ascii="TH Sarabun New" w:hAnsi="TH Sarabun New" w:cs="TH Sarabun New"/>
         </w:rPr>
-        <w:t>3) ตรวจสอบข้อมูลสถิติที่สำคัญ ได้แก่ Total Vectors (จำนวนชิ้นส่วนข้อความ), Dimension (มิติเวกเตอร์), Metric (Cosine Similarity), และกราฟสถิติการใช้งาน (Usage &amp; Request Latency)</w:t>
+        <w:t>3) ดูข้อมูลสำคัญ เช่น Total Vectors (จำนวนชิ้นข้อมูลความรู้ที่เก็บไว้ในระบบ), Dimension (ขนาดมิติของเวกเตอร์ เช่น 768 หรือ 1536) และสถิติการใช้งาน เช่น จำนวนครั้งที่มีการค้นหาข้อมูล</w:t>
       </w:r>
     </w:p>
     <w:tbl>
@@ -1886,7 +1940,7 @@
           <w:sz w:val="32"/>
           <w:rFonts w:ascii="TH Sarabun New" w:hAnsi="TH Sarabun New" w:cs="TH Sarabun New"/>
         </w:rPr>
-        <w:t>หน้าจอจัดการ Index บน Pinecone Vector Database Console</w:t>
+        <w:t>หน้าจอจัดการฐานข้อมูลความรู้บน Pinecone</w:t>
       </w:r>
     </w:p>
     <w:p>
@@ -1903,7 +1957,7 @@
           <w:sz w:val="28"/>
           <w:rFonts w:ascii="TH Sarabun New" w:hAnsi="TH Sarabun New" w:cs="TH Sarabun New"/>
         </w:rPr>
-        <w:t>(คำอธิบายรูป: ภาพหน้าจอแดชบอร์ดบนเว็บไซต์ Pinecone แสดงสถานะ Index จำนวนเวกเตอร์ และมิติข้อมูลของฐานความรู้โรคข้าว)</w:t>
+        <w:t>(คำอธิบายรูป: หน้าจอแดชบอร์ด Pinecone แสดงข้อมูล Index และจำนวนข้อมูลที่จัดเก็บ)</w:t>
       </w:r>
     </w:p>
     <w:p>
@@ -1921,7 +1975,7 @@
           <w:sz w:val="32"/>
           <w:rFonts w:ascii="TH Sarabun New" w:hAnsi="TH Sarabun New" w:cs="TH Sarabun New"/>
         </w:rPr>
-        <w:t>ก.2.5 การอัปเดตและเพิ่มเอกสารความรู้โรคข้าว (Knowledge Ingestion Script)</w:t>
+        <w:t>ก.2.5 การอัปเดตข้อมูลความรู้โรคข้าวเพิ่มเติม</w:t>
       </w:r>
     </w:p>
     <w:p>
@@ -1939,7 +1993,7 @@
           <w:sz w:val="32"/>
           <w:rFonts w:ascii="TH Sarabun New" w:hAnsi="TH Sarabun New" w:cs="TH Sarabun New"/>
         </w:rPr>
-        <w:t>กรณีที่มีข้อมูลโรคข้าวใหม่ สารเคมีชนิดใหม่ หรือต้องการอัปเดตคู่มือวิชาการของกรมการข้าว ผู้ดูแลระบบสามารถเพิ่มข้อมูลเข้าสู่ระบบได้ดังนี้:</w:t>
+        <w:t>หากมีข้อมูลโรคข้าวใหม่ หรือมีคู่มือวิชาการฉบับใหม่จากกรมการข้าว สามารถเพิ่มเข้าสู่ระบบได้ดังนี้:</w:t>
       </w:r>
     </w:p>
     <w:p>
@@ -1957,7 +2011,7 @@
           <w:sz w:val="32"/>
           <w:rFonts w:ascii="TH Sarabun New" w:hAnsi="TH Sarabun New" w:cs="TH Sarabun New"/>
         </w:rPr>
-        <w:t>1) นำไฟล์เอกสารคู่มือฉบับใหม่ (ไฟล์ .pdf หรือ .txt) ไปจัดเก็บไว้ในโฟลเดอร์คลังเอกสารของระบบ (data/knowledge_base/)</w:t>
+        <w:t>1) นำไฟล์เอกสารฉบับใหม่ (ไฟล์ .pdf หรือ .txt) ไปวางไว้ในโฟลเดอร์ data/knowledge_base/</w:t>
       </w:r>
     </w:p>
     <w:p>
@@ -1975,7 +2029,7 @@
           <w:sz w:val="32"/>
           <w:rFonts w:ascii="TH Sarabun New" w:hAnsi="TH Sarabun New" w:cs="TH Sarabun New"/>
         </w:rPr>
-        <w:t>2) เปิดโปรแกรม Terminal หรือ Command Prompt ในเครื่องเซิร์ฟเวอร์</w:t>
+        <w:t>2) เปิดโปรแกรม Terminal หรือ Command Prompt</w:t>
       </w:r>
     </w:p>
     <w:p>
@@ -1993,7 +2047,7 @@
           <w:sz w:val="32"/>
           <w:rFonts w:ascii="TH Sarabun New" w:hAnsi="TH Sarabun New" w:cs="TH Sarabun New"/>
         </w:rPr>
-        <w:t>3) รันคำสั่งสคริปต์สำหรับการนำเข้าข้อมูลความรู้ เช่น python scripts/ingest_knowledge.py</w:t>
+        <w:t>3) พิมพ์คำสั่งรันสคริปต์: python scripts/ingest_knowledge.py</w:t>
       </w:r>
     </w:p>
     <w:p>
@@ -2011,7 +2065,7 @@
           <w:sz w:val="32"/>
           <w:rFonts w:ascii="TH Sarabun New" w:hAnsi="TH Sarabun New" w:cs="TH Sarabun New"/>
         </w:rPr>
-        <w:t>4) สคริปต์จะทำการอ่านเอกสาร ตัดแบ่งข้อความออกเป็นส่วนย่อย (Chunking), คำนวณค่า Vector Embeddings ด้วยโมเดลภาษา และอัปโหลดเวกเตอร์ชุดใหม่เข้าสู่ Pinecone Index โดยอัตโนมัติ ทำให้ระบบ RAG นำความรู้ใหม่ไปใช้ตอบคำถามได้ทันทีโดยไม่ต้องเทรนโมเดลใหม่</w:t>
+        <w:t>4) ระบบจะอ่านเอกสาร ตัดแบ่งข้อความ และแปลงเป็นข้อมูลเวกเตอร์อัปโหลดเข้า Pinecone ให้โดยอัตโนมัติ ทำให้บอทสามารถนำข้อมูลใหม่ไปใช้ตอบคำถามผู้ใช้ได้ทันที</w:t>
       </w:r>
     </w:p>
     <w:tbl>
@@ -2092,7 +2146,7 @@
           <w:sz w:val="32"/>
           <w:rFonts w:ascii="TH Sarabun New" w:hAnsi="TH Sarabun New" w:cs="TH Sarabun New"/>
         </w:rPr>
-        <w:t>หน้าต่างการรันสคริปต์อัปเดตเอกสารความรู้โรคข้าวเข้าสู่ Vector Database</w:t>
+        <w:t>การรันคำสั่งอัปเดตข้อมูลความรู้โรคข้าว</w:t>
       </w:r>
     </w:p>
     <w:p>
@@ -2109,7 +2163,7 @@
           <w:sz w:val="28"/>
           <w:rFonts w:ascii="TH Sarabun New" w:hAnsi="TH Sarabun New" w:cs="TH Sarabun New"/>
         </w:rPr>
-        <w:t>(คำอธิบายรูป: ภาพหน้าจอ Terminal ขณะรันสคริปต์ Ingestion แสดงขั้นตอนการอ่านไฟล์เอกสาร การทำ Chunking และการอัปโหลดเวกเตอร์ขึ้น Pinecone สำเร็จ)</w:t>
+        <w:t>(คำอธิบายรูป: หน้าต่าง Terminal ตอนรันคำสั่งเพิ่มข้อมูลคู่มือโรคข้าวเข้าสู่ฐานข้อมูล)</w:t>
       </w:r>
     </w:p>
     <w:sectPr>

</xml_diff>

<commit_message>
fix(thesis): align Appendix A with full thesis docx facts (Rich Menu 3 buttons, LINE ID, rice-knowledge index)
</commit_message>
<xml_diff>
--- a/Project/Appendix_A.docx
+++ b/Project/Appendix_A.docx
@@ -2,7 +2,6 @@
 <file path=word/document.xml><?xml version="1.0" encoding="utf-8"?>
 <w:document xmlns:wpc="http://schemas.microsoft.com/office/word/2010/wordprocessingCanvas" xmlns:mo="http://schemas.microsoft.com/office/mac/office/2008/main" xmlns:mc="http://schemas.openxmlformats.org/markup-compatibility/2006" xmlns:mv="urn:schemas-microsoft-com:mac:vml" xmlns:o="urn:schemas-microsoft-com:office:office" xmlns:r="http://schemas.openxmlformats.org/officeDocument/2006/relationships" xmlns:m="http://schemas.openxmlformats.org/officeDocument/2006/math" xmlns:v="urn:schemas-microsoft-com:vml" xmlns:wp14="http://schemas.microsoft.com/office/word/2010/wordprocessingDrawing" xmlns:wp="http://schemas.openxmlformats.org/drawingml/2006/wordprocessingDrawing" xmlns:w10="urn:schemas-microsoft-com:office:word" xmlns:w="http://schemas.openxmlformats.org/wordprocessingml/2006/main" xmlns:w14="http://schemas.microsoft.com/office/word/2010/wordml" xmlns:wpg="http://schemas.microsoft.com/office/word/2010/wordprocessingGroup" xmlns:wpi="http://schemas.microsoft.com/office/word/2010/wordprocessingInk" xmlns:wne="http://schemas.microsoft.com/office/word/2006/wordml" xmlns:wps="http://schemas.microsoft.com/office/word/2010/wordprocessingShape" mc:Ignorable="w14 wp14">
   <w:body>
-    <w:p/>
     <w:p/>
     <w:p/>
     <w:p/>
@@ -39,7 +38,9 @@
           <w:sz w:val="36"/>
           <w:rFonts w:ascii="TH Sarabun New" w:hAnsi="TH Sarabun New" w:cs="TH Sarabun New"/>
         </w:rPr>
-        <w:t>คู่มือการใช้งานระบบแชทบอทวิเคราะห์โรคข้าว</w:t>
+        <w:t>คู่มือการใช้งานระบบแชทบอทวินิจฉัยโรคข้าวและแนะนำวิธีการรักษา</w:t>
+        <w:br/>
+        <w:t>ผ่านแอปพลิเคชันไลน์ด้วยเทคนิค RAG</w:t>
       </w:r>
     </w:p>
     <w:p>
@@ -61,7 +62,9 @@
           <w:sz w:val="36"/>
           <w:rFonts w:ascii="TH Sarabun New" w:hAnsi="TH Sarabun New" w:cs="TH Sarabun New"/>
         </w:rPr>
-        <w:t>คู่มือการใช้งานระบบแชทบอทวิเคราะห์โรคข้าว</w:t>
+        <w:t>คู่มือการใช้งานระบบแชทบอทวินิจฉัยโรคข้าวและแนะนำวิธีการรักษา</w:t>
+        <w:br/>
+        <w:t>ผ่านแอปพลิเคชันไลน์ด้วยเทคนิค RAG</w:t>
       </w:r>
     </w:p>
     <w:p>
@@ -79,7 +82,7 @@
           <w:sz w:val="32"/>
           <w:rFonts w:ascii="TH Sarabun New" w:hAnsi="TH Sarabun New" w:cs="TH Sarabun New"/>
         </w:rPr>
-        <w:t>คู่มือการใช้งานระบบแชทบอทวิเคราะห์โรคข้าว แบ่งออกเป็น 2 ส่วน ดังนี้</w:t>
+        <w:t>คู่มือการใช้งานระบบแชทบอทวินิจฉัยโรคข้าวและแนะนำวิธีการรักษา แบ่งออกเป็น 2 ส่วน ดังนี้</w:t>
       </w:r>
     </w:p>
     <w:p>
@@ -97,7 +100,7 @@
           <w:sz w:val="32"/>
           <w:rFonts w:ascii="TH Sarabun New" w:hAnsi="TH Sarabun New" w:cs="TH Sarabun New"/>
         </w:rPr>
-        <w:t>1) ส่วนสำหรับผู้ใช้งานทั่วไป (เกษตรกร): การใช้งานแชทบอทผ่านแอปพลิเคชัน LINE</w:t>
+        <w:t>1) ส่วนสำหรับผู้ใช้งานทั่วไป (เกษตรกร): การใช้งานแชทบอทผ่านบัญชี LINE Official Account (@325wtzzd)</w:t>
       </w:r>
     </w:p>
     <w:p>
@@ -115,7 +118,7 @@
           <w:sz w:val="32"/>
           <w:rFonts w:ascii="TH Sarabun New" w:hAnsi="TH Sarabun New" w:cs="TH Sarabun New"/>
         </w:rPr>
-        <w:t>2) ส่วนสำหรับผู้ดูแลระบบ (Admin): การจัดการระบบทำงานอัตโนมัติ (n8n) และฐานข้อมูลความรู้ (Pinecone)</w:t>
+        <w:t>2) ส่วนสำหรับผู้ดูแลระบบ (Admin): การจัดการระบบเวิร์กโฟลว์อัตโนมัติ (n8n) และฐานข้อมูลความรู้เวกเตอร์ (Pinecone)</w:t>
       </w:r>
     </w:p>
     <w:p>
@@ -168,7 +171,7 @@
           <w:sz w:val="32"/>
           <w:rFonts w:ascii="TH Sarabun New" w:hAnsi="TH Sarabun New" w:cs="TH Sarabun New"/>
         </w:rPr>
-        <w:t>ผู้ใช้สามารถเริ่มต้นใช้งานได้ง่าย ๆ โดยการเพิ่มเพื่อนใน LINE ผ่าน 2 วิธี ได้แก่ การสแกนคิวอาร์โค้ด (QR Code) ของแชทบอท หรือค้นหาด้วย LINE ID (@บอทวินิจฉัยโรคข้าว) เมื่อกดเพิ่มเพื่อนและเปิดเข้าไปในห้องแชท แชทบอทจะส่งข้อความทักทายต้อนรับ แนะนำตัว และบอกวิธีใช้งานเบื้องต้น พร้อมกับแสดงเมนูหลักที่ด้านล่างของหน้าจอทันที</w:t>
+        <w:t>ผู้ใช้สามารถเริ่มต้นใช้งานได้ง่าย ๆ โดยการเพิ่มเพื่อนใน LINE ผ่าน 2 วิธี ได้แก่ การสแกนคิวอาร์โค้ด (QR Code) ประจำบัญชีทางการ หรือค้นหาด้วย LINE ID: @325wtzzd (ชื่อบัญชี: บอทวินิจฉัยโรคข้าว หรือ Rice Disease AI) เมื่อกดเพิ่มเพื่อนและเปิดเข้าไปในห้องแชท แชทบอทจะส่งข้อความทักทายต้อนรับ แนะนำตัว และบอกวิธีใช้งานเบื้องต้น พร้อมกับแสดงแถบเมนูลัด (Rich Menu) 3 ปุ่มที่ด้านล่างของหน้าจอทันที</w:t>
       </w:r>
     </w:p>
     <w:tbl>
@@ -249,7 +252,7 @@
           <w:sz w:val="32"/>
           <w:rFonts w:ascii="TH Sarabun New" w:hAnsi="TH Sarabun New" w:cs="TH Sarabun New"/>
         </w:rPr>
-        <w:t>การเพิ่มเพื่อนและข้อความต้อนรับของแชทบอท</w:t>
+        <w:t>การเพิ่มเพื่อนและข้อความต้อนรับเข้าสู่ระบบแชทบอท</w:t>
       </w:r>
     </w:p>
     <w:p>
@@ -266,7 +269,7 @@
           <w:sz w:val="28"/>
           <w:rFonts w:ascii="TH Sarabun New" w:hAnsi="TH Sarabun New" w:cs="TH Sarabun New"/>
         </w:rPr>
-        <w:t>(คำอธิบายรูป: หน้าจอ LINE ตอนกดเพิ่มเพื่อน และมีข้อความต้อนรับพร้อมเมนูด้านล่างปรากฏขึ้น)</w:t>
+        <w:t>(คำอธิบายรูป: ภาพหน้าจอแอปพลิเคชัน LINE ขณะเพิ่มเพื่อนสำเร็จ มีข้อความต้อนรับอัตโนมัติปรากฏขึ้น และมีแถบ Rich Menu แสดงอยู่ที่ด้านล่างของหน้าจอ)</w:t>
       </w:r>
     </w:p>
     <w:p>
@@ -302,7 +305,7 @@
           <w:sz w:val="32"/>
           <w:rFonts w:ascii="TH Sarabun New" w:hAnsi="TH Sarabun New" w:cs="TH Sarabun New"/>
         </w:rPr>
-        <w:t>ที่แถบด้านล่างของหน้าจอแชทจะมีเมนูลัดให้กดใช้งานได้สะดวก แบ่งออกเป็น 3 ปุ่มหลัก ดังนี้:</w:t>
+        <w:t>ที่แถบด้านล่างของหน้าจอห้องแชทจะแสดงเมนูลัด (Rich Menu) ให้กดใช้งานได้อย่างสะดวกรวดเร็ว โดยแบ่งออกเป็น 3 ปุ่มคำสั่งหลัก ได้แก่:</w:t>
       </w:r>
     </w:p>
     <w:p>
@@ -320,7 +323,7 @@
           <w:sz w:val="32"/>
           <w:rFonts w:ascii="TH Sarabun New" w:hAnsi="TH Sarabun New" w:cs="TH Sarabun New"/>
         </w:rPr>
-        <w:t>1) ตรวจโรคข้าว: แนะนำวิธีการส่งรูปถ่ายใบข้าวเพื่อให้บอทช่วยตรวจ</w:t>
+        <w:t>1) ถ่ายภาพตรวจโรคข้าว (TAKE DIAGNOSIS PHOTO): เมื่อกดปุ่ม ระบบจะเปิดกล้องถ่ายรูปบนโทรศัพท์มือถือ เพื่อให้เกษตรกรสามารถเล็งถ่ายภาพใบข้าวที่มีอาการผิดปกติจากแปลงนาส่งตรวจได้ทันที</w:t>
       </w:r>
     </w:p>
     <w:p>
@@ -338,7 +341,7 @@
           <w:sz w:val="32"/>
           <w:rFonts w:ascii="TH Sarabun New" w:hAnsi="TH Sarabun New" w:cs="TH Sarabun New"/>
         </w:rPr>
-        <w:t>2) วิธีการใช้งาน: บอกขั้นตอนการถ่ายรูปใบข้าวให้ชัดเจน และตัวอย่างคำถามที่สามารถพิมพ์ถามบอทได้</w:t>
+        <w:t>2) ส่งภาพตรวจโรคข้าว (SUBMIT DISEASE PHOTO): เมื่อกดปุ่ม ระบบจะเปิดคลังภาพ (Gallery) หรืออัลบั้มในโทรศัพท์ เพื่อให้เลือกรูปภาพใบข้าวที่เคยถ่ายเก็บไว้ส่งเข้ามาให้ระบบวิเคราะห์</w:t>
       </w:r>
     </w:p>
     <w:p>
@@ -356,7 +359,7 @@
           <w:sz w:val="32"/>
           <w:rFonts w:ascii="TH Sarabun New" w:hAnsi="TH Sarabun New" w:cs="TH Sarabun New"/>
         </w:rPr>
-        <w:t>3) เกี่ยวกับระบบ: แสดงข้อมูลเกี่ยวกับโครงงาน และหน่วยงานอ้างอิงข้อมูล (กรมการข้าว)</w:t>
+        <w:t>3) วิธีการใช้งานแชทบอท (CHATBOT USER GUIDE): เมื่อกดปุ่ม ระบบจะส่งข้อความแนะนำขั้นตอนการใช้งานระบบ 3 ขั้นตอน และเทคนิคการถ่ายภาพใบข้าวระยะใกล้ให้คมชัด พร้อมตัวอย่างคำถามที่สามารถพิมพ์ถามบอทได้</w:t>
       </w:r>
     </w:p>
     <w:tbl>
@@ -437,7 +440,7 @@
           <w:sz w:val="32"/>
           <w:rFonts w:ascii="TH Sarabun New" w:hAnsi="TH Sarabun New" w:cs="TH Sarabun New"/>
         </w:rPr>
-        <w:t>หน้าจอเมนูหลักด้านล่าง (Rich Menu)</w:t>
+        <w:t>หน้าจอแถบเมนูลัด (Rich Menu 3 ปุ่ม) ด้านล่างของห้องแชท LINE</w:t>
       </w:r>
     </w:p>
     <w:p>
@@ -454,7 +457,7 @@
           <w:sz w:val="28"/>
           <w:rFonts w:ascii="TH Sarabun New" w:hAnsi="TH Sarabun New" w:cs="TH Sarabun New"/>
         </w:rPr>
-        <w:t>(คำอธิบายรูป: หน้าจอ LINE แสดงปุ่มเมนูด้านล่าง 3 ปุ่ม ได้แก่ ตรวจโรคข้าว, วิธีการใช้งาน, และเกี่ยวกับระบบ)</w:t>
+        <w:t>(คำอธิบายรูป: ภาพหน้าจอแสดงแถบ Rich Menu ด้านล่างของห้องแชท LINE ประกอบด้วย 3 ปุ่มคำสั่ง: ถ่ายภาพตรวจโรคข้าว, ส่งภาพตรวจโรคข้าว, และวิธีการใช้งานแชทบอท)</w:t>
       </w:r>
     </w:p>
     <w:p>
@@ -472,7 +475,7 @@
           <w:sz w:val="32"/>
           <w:rFonts w:ascii="TH Sarabun New" w:hAnsi="TH Sarabun New" w:cs="TH Sarabun New"/>
         </w:rPr>
-        <w:t>ก.1.3 การส่งรูปภาพใบข้าวเพื่อตรวจโรค</w:t>
+        <w:t>ก.1.3 การส่งรูปภาพใบข้าวเพื่อตรวจวินิจฉัยโรค</w:t>
       </w:r>
     </w:p>
     <w:p>
@@ -508,7 +511,7 @@
           <w:sz w:val="32"/>
           <w:rFonts w:ascii="TH Sarabun New" w:hAnsi="TH Sarabun New" w:cs="TH Sarabun New"/>
         </w:rPr>
-        <w:t>1) กดที่ไอคอน “กล้องถ่ายรูป” เพื่อถ่ายรูปใบข้าวในนาจริง หรือกดไอคอน “รูปภาพ” เพื่อเลือกรูปถ่ายที่มีอยู่ในเครื่อง</w:t>
+        <w:t>1) กดที่ปุ่ม “ถ่ายภาพตรวจโรคข้าว” เพื่อเปิดกล้องถ่ายภาพจริงในแปลงนา หรือกดปุ่ม “ส่งภาพตรวจโรคข้าว” เพื่อเลือกรูปภาพที่มีอยู่ในเครื่อง</w:t>
       </w:r>
     </w:p>
     <w:p>
@@ -526,7 +529,7 @@
           <w:sz w:val="32"/>
           <w:rFonts w:ascii="TH Sarabun New" w:hAnsi="TH Sarabun New" w:cs="TH Sarabun New"/>
         </w:rPr>
-        <w:t>2) คำแนะนำในการถ่ายรูป: ควรถ่ายรูปใบข้าวใกล้ ๆ (ระยะใกล้) ให้เห็นแผลหรือรอยโรคชัดเจน ให้ใบข้าวอยู่ตรงกลางภาพ มีแสงสว่างพอดี และหลีกเลี่ยงภาพเบลอ ภาพสั่น หรือภาพมุมกว้างทั้งแปลงนา</w:t>
+        <w:t>2) คำแนะนำในการถ่ายรูป: ควรถ่ายภาพใบข้าวในระยะใกล้ (ประมาณ 15–30 เซนติเมตร) ให้เห็นรอยโรคชัดเจนอยู่บริเวณกึ่งกลางภาพ มีแสงสว่างเพียงพอ หลีกเลี่ยงภาพเบลอ ภาพสั่น หรือการถ่ายย้อนแสงแดดจัด และหลีกเลี่ยงการถ่ายภาพมุมกว้างที่เห็นทั้งแปลงนา เพราะ AI จะมองไม่เห็นรายละเอียดของแผล</w:t>
       </w:r>
     </w:p>
     <w:p>
@@ -544,7 +547,7 @@
           <w:sz w:val="32"/>
           <w:rFonts w:ascii="TH Sarabun New" w:hAnsi="TH Sarabun New" w:cs="TH Sarabun New"/>
         </w:rPr>
-        <w:t>3) กดปุ่ม “ส่ง” รูปภาพเข้าห้องแชท บอทจะส่งข้อความแจ้งว่ากำลังวิเคราะห์รูปภาพ ให้รอสักครู่</w:t>
+        <w:t>3) กดปุ่ม “ส่ง” รูปภาพเข้าสู่ห้องแชท ระบบจะส่งข้อความแจ้งเตือนสถานะการประมวลผลให้ผู้ใช้ทราบว่ากำลังวิเคราะห์รูปภาพ</w:t>
       </w:r>
     </w:p>
     <w:tbl>
@@ -625,7 +628,7 @@
           <w:sz w:val="32"/>
           <w:rFonts w:ascii="TH Sarabun New" w:hAnsi="TH Sarabun New" w:cs="TH Sarabun New"/>
         </w:rPr>
-        <w:t>การเลือกและส่งรูปภาพใบข้าวเข้าสู่ห้องแชท</w:t>
+        <w:t>การเลือกและส่งรูปภาพใบข้าวที่มีรอยโรคเข้าสู่ห้องแชท LINE</w:t>
       </w:r>
     </w:p>
     <w:p>
@@ -642,7 +645,7 @@
           <w:sz w:val="28"/>
           <w:rFonts w:ascii="TH Sarabun New" w:hAnsi="TH Sarabun New" w:cs="TH Sarabun New"/>
         </w:rPr>
-        <w:t>(คำอธิบายรูป: หน้าจอ LINE ตอนเลือกรูปถ่ายใบข้าวที่มีอาการผิดปกติและกดส่งเข้าไปในแชท)</w:t>
+        <w:t>(คำอธิบายรูป: ภาพหน้าจอขณะผู้ใช้เลือกภาพถ่ายใบข้าวที่มีอาการของโรคจากอัลบั้มหรือกล้อง และกดส่งเข้ามาในห้องแชท)</w:t>
       </w:r>
     </w:p>
     <w:p>
@@ -660,7 +663,7 @@
           <w:sz w:val="32"/>
           <w:rFonts w:ascii="TH Sarabun New" w:hAnsi="TH Sarabun New" w:cs="TH Sarabun New"/>
         </w:rPr>
-        <w:t>ก.1.4 การรับผลการตรวจและวิธีรักษาโรค</w:t>
+        <w:t>ก.1.4 การรับผลการวินิจฉัยโรคและคำแนะนำการรักษา</w:t>
       </w:r>
     </w:p>
     <w:p>
@@ -678,7 +681,7 @@
           <w:sz w:val="32"/>
           <w:rFonts w:ascii="TH Sarabun New" w:hAnsi="TH Sarabun New" w:cs="TH Sarabun New"/>
         </w:rPr>
-        <w:t>เมื่อบอทวิเคราะห์รูปภาพเสร็จแล้ว จะส่งข้อความบอกรายละเอียดกลับมา 3 ส่วน ดังนี้:</w:t>
+        <w:t>เมื่อระบบประมวลผลภาพเสร็จสิ้น แชทบอทจะส่งข้อความตอบกลับในรูปแบบข้อความตัวหนังสือที่มีโครงสร้างชัดเจนและอ่านง่าย ประกอบด้วย 2 ส่วนสำคัญ ได้แก่:</w:t>
       </w:r>
     </w:p>
     <w:p>
@@ -696,25 +699,7 @@
           <w:sz w:val="32"/>
           <w:rFonts w:ascii="TH Sarabun New" w:hAnsi="TH Sarabun New" w:cs="TH Sarabun New"/>
         </w:rPr>
-        <w:t>1) ผลการตรวจวินิจฉัย: บอกชื่อโรคข้าวที่ตรวจพบ (ทั้งภาษาไทยและภาษาอังกฤษ เช่น โรคไหม้ข้าว / Rice Blast) พร้อมบอกระดับความมั่นใจของระบบเป็นเปอร์เซ็นต์</w:t>
-      </w:r>
-    </w:p>
-    <w:p>
-      <w:pPr>
-        <w:spacing w:line="276" w:lineRule="auto" w:before="0" w:after="40"/>
-        <w:ind w:firstLine="1080"/>
-        <w:jc w:val="left"/>
-      </w:pPr>
-      <w:r>
-        <w:rPr>
-          <w:rFonts w:ascii="TH Sarabun New" w:hAnsi="TH Sarabun New"/>
-          <w:b w:val="0"/>
-          <w:i w:val="0"/>
-          <w:color w:val="000000"/>
-          <w:sz w:val="32"/>
-          <w:rFonts w:ascii="TH Sarabun New" w:hAnsi="TH Sarabun New" w:cs="TH Sarabun New"/>
-        </w:rPr>
-        <w:t>2) สาเหตุและอาการของโรค: อธิบายว่าโรคเกิดจากเชื้อราหรือแบคทีเรีย และมีลักษณะแผลบนใบอย่างไร</w:t>
+        <w:t>1) ผลการวินิจฉัยโรคข้าว: ระบุชื่อโรคข้าวที่ตรวจพบ (เช่น โรคใบจุดสีน้ำตาล, โรคไหม้ข้าว, โรคขอบใบแห้ง) พร้อมระบุระดับความมั่นใจของโมเดล (Confidence Score เช่น ความมั่นใจ 85.8%)</w:t>
       </w:r>
     </w:p>
     <w:p>
@@ -732,7 +717,7 @@
           <w:sz w:val="32"/>
           <w:rFonts w:ascii="TH Sarabun New" w:hAnsi="TH Sarabun New" w:cs="TH Sarabun New"/>
         </w:rPr>
-        <w:t>3) วิธีรักษาและการดูแล: แนะนำวิธีจัดการแปลงนา และชนิดของยาหรือสารชีวภัณฑ์ที่แนะนำให้ใช้ พร้อมอัตราการผสมฉีดพ่นตามคู่มือของกรมการข้าว</w:t>
+        <w:t>2) คำแนะนำและการรักษา: สรุปวิธีปฏิบัติตามคู่มือวิชาการของกรมการข้าว กระทรวงเกษตรและสหกรณ์ ได้แก่ การเตรียมเมล็ดพันธุ์ก่อนปลูก, การจัดการแปลงนา, และการใช้สารเคมีป้องกันกำจัดโรคพืช (ชื่อสารเคมีที่แนะนำ เช่น ไตรไซคลาโซล, แมนโคเซบ, คาร์เบนดาซิม, คาซูกาไมซิน) พร้อมอัตราส่วนผสมที่ปลอดภัย</w:t>
       </w:r>
     </w:p>
     <w:tbl>
@@ -813,7 +798,7 @@
           <w:sz w:val="32"/>
           <w:rFonts w:ascii="TH Sarabun New" w:hAnsi="TH Sarabun New" w:cs="TH Sarabun New"/>
         </w:rPr>
-        <w:t>ข้อความผลการวินิจฉัยโรคและคำแนะนำการรักษา</w:t>
+        <w:t>ข้อความผลการวินิจฉัยโรคและคำแนะนำการรักษาที่บอทส่งตอบกลับผู้ใช้</w:t>
       </w:r>
     </w:p>
     <w:p>
@@ -830,7 +815,7 @@
           <w:sz w:val="28"/>
           <w:rFonts w:ascii="TH Sarabun New" w:hAnsi="TH Sarabun New" w:cs="TH Sarabun New"/>
         </w:rPr>
-        <w:t>(คำอธิบายรูป: หน้าจอแสดงข้อความที่แชทบอทตอบกลับ บอกชื่อโรค เปอร์เซ็นต์ความมั่นใจ สาเหตุ และวิธีรักษา)</w:t>
+        <w:t>(คำอธิบายรูป: ภาพหน้าจอข้อความผลลัพธ์ที่แชทบอทส่งกลับมา แสดงชื่อโรค ค่าความมั่นใจ และคำแนะนำการรักษาตามคู่มือกรมการข้าว)</w:t>
       </w:r>
     </w:p>
     <w:p>
@@ -848,7 +833,7 @@
           <w:sz w:val="32"/>
           <w:rFonts w:ascii="TH Sarabun New" w:hAnsi="TH Sarabun New" w:cs="TH Sarabun New"/>
         </w:rPr>
-        <w:t>ก.1.5 การพิมพ์ข้อความสอบถามข้อมูลโรคข้าว</w:t>
+        <w:t>ก.1.5 การพิมพ์ข้อความสอบถามข้อมูลโรคข้าวเพิ่มเติม</w:t>
       </w:r>
     </w:p>
     <w:p>
@@ -866,7 +851,7 @@
           <w:sz w:val="32"/>
           <w:rFonts w:ascii="TH Sarabun New" w:hAnsi="TH Sarabun New" w:cs="TH Sarabun New"/>
         </w:rPr>
-        <w:t>นอกจากส่งรูปภาพแล้ว ผู้ใช้ยังสามารถพิมพ์ข้อความถามข้อสงสัยเกี่ยวกับโรคข้าวหรือการดูแลรักษาได้เลย เช่น “โรคขอบใบแห้งเกิดจากอะไร”, “ถ้าข้าวเป็นโรคไหม้ต้องใช้ยาตัวไหนฉีด”, หรือ “โรคใบจุดสีน้ำตาลมีวิธีป้องกันยังไง” บอทจะค้นหาข้อมูลจากคู่มือวิชาการของกรมการข้าว แล้วสรุปคำตอบที่เข้าใจง่ายและตรงจุดส่งกลับมาให้ทันที</w:t>
+        <w:t>นอกจากส่งรูปภาพแล้ว เกษตรกรสามารถพิมพ์ข้อความสอบถามข้อสงสัยเกี่ยวกับโรคข้าว การดูแลรักษา หรือการใช้ยาได้โดยตรง เช่น “โรคใบไหม้รักษายังไง ใช้สารเคมีอะไร”, “โรคขอบใบแห้งเกิดจากอะไร”, หรือ “โรคจุดน้ำตาลเป็นยังไง” ระบบสืบค้นข้อมูลความรู้ (Hybrid RAG) จะค้นหาข้อมูลที่ตรงจุดจากฐานข้อมูลคู่มือวิชาการของกรมการข้าว และใช้ AI ช่วยเรียบเรียงคำตอบที่เข้าใจง่ายและตรงจุดส่งกลับมาให้ทันที</w:t>
       </w:r>
     </w:p>
     <w:tbl>
@@ -947,7 +932,7 @@
           <w:sz w:val="32"/>
           <w:rFonts w:ascii="TH Sarabun New" w:hAnsi="TH Sarabun New" w:cs="TH Sarabun New"/>
         </w:rPr>
-        <w:t>การพิมพ์ข้อความสอบถามข้อมูลโรคข้าว</w:t>
+        <w:t>การพิมพ์ข้อความสอบถามข้อมูลโรคข้าวและคำตอบจากระบบ</w:t>
       </w:r>
     </w:p>
     <w:p>
@@ -964,7 +949,7 @@
           <w:sz w:val="28"/>
           <w:rFonts w:ascii="TH Sarabun New" w:hAnsi="TH Sarabun New" w:cs="TH Sarabun New"/>
         </w:rPr>
-        <w:t>(คำอธิบายรูป: หน้าจอตอนพิมพ์ถามข้อสงสัยเรื่องโรคข้าว และบอทตอบคำแนะนำกลับมา)</w:t>
+        <w:t>(คำอธิบายรูป: ภาพหน้าจอการสนทนาที่ผู้ใช้พิมพ์คำถามเกี่ยวกับโรคข้าวหรือการใช้ยา และแชทบอทตอบกลับด้วยคำแนะนำที่ถูกต้องตามหลักวิชาการ)</w:t>
       </w:r>
     </w:p>
     <w:p>
@@ -982,7 +967,7 @@
           <w:sz w:val="32"/>
           <w:rFonts w:ascii="TH Sarabun New" w:hAnsi="TH Sarabun New" w:cs="TH Sarabun New"/>
         </w:rPr>
-        <w:t>ก.1.6 การแจ้งเตือนกรณีส่งรูปไม่ชัดเจนหรือถามนอกเรื่อง</w:t>
+        <w:t>ก.1.6 การแจ้งเตือนกรณีส่งรูปไม่ชัดเจนหรืออยู่นอกขอบเขต (Fallback &amp; Guardrails)</w:t>
       </w:r>
     </w:p>
     <w:p>
@@ -1000,7 +985,7 @@
           <w:sz w:val="32"/>
           <w:rFonts w:ascii="TH Sarabun New" w:hAnsi="TH Sarabun New" w:cs="TH Sarabun New"/>
         </w:rPr>
-        <w:t>ระบบมีการแจ้งเตือนเพื่อช่วยแนะนำผู้ใช้งานในกรณีต่าง ๆ ดังนี้:</w:t>
+        <w:t>ระบบมีข้อความแจ้งเตือนเพื่อช่วยแนะนำผู้ใช้งานในกรณีต่าง ๆ ดังนี้:</w:t>
       </w:r>
     </w:p>
     <w:p>
@@ -1018,7 +1003,7 @@
           <w:sz w:val="32"/>
           <w:rFonts w:ascii="TH Sarabun New" w:hAnsi="TH Sarabun New" w:cs="TH Sarabun New"/>
         </w:rPr>
-        <w:t>1) ถ้าส่งรูปอื่นที่ไม่ใช่ใบข้าว หรือภาพมองไม่เห็นรอยโรค: บอทจะตอบว่า “ตรวจไม่พบรอยโรคข้าวในภาพ กรุณาถ่ายภาพใบข้าวที่มีรอยโรคให้ชัดเจนในระยะใกล้แล้วส่งใหม่อีกครั้ง”</w:t>
+        <w:t>1) ถ้าส่งรูปอื่นที่ไม่ใช่ใบข้าว หรือภาพมองไม่เห็นรอยโรค: บอทจะตอบว่า “ระบบตรวจไม่พบรอยโรคข้าวในภาพ กรุณาถ่ายภาพใบข้าวที่มีรอยโรคให้ชัดเจนในระยะใกล้และส่งใหม่อีกครั้ง”</w:t>
       </w:r>
     </w:p>
     <w:p>
@@ -1036,7 +1021,7 @@
           <w:sz w:val="32"/>
           <w:rFonts w:ascii="TH Sarabun New" w:hAnsi="TH Sarabun New" w:cs="TH Sarabun New"/>
         </w:rPr>
-        <w:t>2) ถ้าพิมพ์ถามเรื่องอื่นที่ไม่เกี่ยวกับข้าว: เช่น ถามสภาพอากาศ ราคาทอง หรือถามเรื่องพืชชนิดอื่น บอทจะแจ้งอย่างสุภาพว่า ระบบนี้เชี่ยวชาญเฉพาะเรื่องโรคข้าว จึงไม่สามารถตอบเรื่องอื่นได้</w:t>
+        <w:t>2) ถ้าพิมพ์ถามเรื่องอื่นที่ไม่เกี่ยวกับข้าว: เช่น ถามสภาพอากาศ ราคาทอง หรือถามเรื่องพืชชนิดอื่น ระบบ Guardrail จะตอบปฏิเสธอย่างสุภาพว่า “ขออภัยครับ ระบบนี้เป็น AI ผู้ช่วยวินิจฉัยและให้คำปรึกษาเรื่องโรคข้าวจากกรมการข้าวโดยเฉพาะ จึงสามารถตอบได้เฉพาะเรื่องโรคข้าวและการดูแลรักษาเท่านั้นครับ”</w:t>
       </w:r>
     </w:p>
     <w:tbl>
@@ -1117,7 +1102,7 @@
           <w:sz w:val="32"/>
           <w:rFonts w:ascii="TH Sarabun New" w:hAnsi="TH Sarabun New" w:cs="TH Sarabun New"/>
         </w:rPr>
-        <w:t>การแจ้งเตือนเมื่อส่งภาพที่ไม่ใช่ใบข้าวหรือถามนอกเรื่อง</w:t>
+        <w:t>การแจ้งเตือนเมื่อส่งภาพที่ไม่ใช่ใบข้าวหรือถามคำถามนอกเรื่อง</w:t>
       </w:r>
     </w:p>
     <w:p>
@@ -1134,7 +1119,7 @@
           <w:sz w:val="28"/>
           <w:rFonts w:ascii="TH Sarabun New" w:hAnsi="TH Sarabun New" w:cs="TH Sarabun New"/>
         </w:rPr>
-        <w:t>(คำอธิบายรูป: หน้าจอแชทบอทตอบแจ้งเตือนเมื่อตรวจไม่พบโรคข้าว หรือพิมพ์ถามเรื่องที่ไม่เกี่ยวข้อง)</w:t>
+        <w:t>(คำอธิบายรูป: ภาพหน้าจอแสดงข้อความปฏิเสธอย่างสุภาพของแชทบอทเมื่อผู้ใช้ส่งภาพวัตถุอื่นหรือพิมพ์คำถามที่ไม่เกี่ยวข้องกับเรื่องโรคข้าว)</w:t>
       </w:r>
     </w:p>
     <w:p>
@@ -1169,7 +1154,7 @@
           <w:sz w:val="32"/>
           <w:rFonts w:ascii="TH Sarabun New" w:hAnsi="TH Sarabun New" w:cs="TH Sarabun New"/>
         </w:rPr>
-        <w:t>ก.2.1 การเข้าสู่ระบบจัดการ (n8n Login)</w:t>
+        <w:t>ก.2.1 การเข้าสู่ระบบจัดการเวิร์กโฟลว์ (n8n Login)</w:t>
       </w:r>
     </w:p>
     <w:p>
@@ -1205,7 +1190,7 @@
           <w:sz w:val="32"/>
           <w:rFonts w:ascii="TH Sarabun New" w:hAnsi="TH Sarabun New" w:cs="TH Sarabun New"/>
         </w:rPr>
-        <w:t>1) เปิดเว็บเบราว์เซอร์ (เช่น Google Chrome) แล้วพิมพ์ลิงก์ของระบบ n8n (เช่น http://localhost:5678 หรือลิงก์ประจำเซิร์ฟเวอร์)</w:t>
+        <w:t>1) เปิดโปรแกรมเว็บเบราว์เซอร์ (เช่น Google Chrome) แล้วพิมพ์ URL ของระบบ n8n (เช่น http://158.108.113.124:5678 หรือ URL ประจำเซิร์ฟเวอร์)</w:t>
       </w:r>
     </w:p>
     <w:p>
@@ -1223,7 +1208,7 @@
           <w:sz w:val="32"/>
           <w:rFonts w:ascii="TH Sarabun New" w:hAnsi="TH Sarabun New" w:cs="TH Sarabun New"/>
         </w:rPr>
-        <w:t>2) กรอก Email และ Password ของผู้ดูแลระบบ</w:t>
+        <w:t>2) กรอก Email และ Password ของบัญชีผู้ดูแลระบบ</w:t>
       </w:r>
     </w:p>
     <w:p>
@@ -1241,7 +1226,7 @@
           <w:sz w:val="32"/>
           <w:rFonts w:ascii="TH Sarabun New" w:hAnsi="TH Sarabun New" w:cs="TH Sarabun New"/>
         </w:rPr>
-        <w:t>3) กดปุ่ม “Sign in” เพื่อเข้าสู่หน้าแดชบอร์ด</w:t>
+        <w:t>3) กดปุ่ม “Sign in” เพื่อเข้าสู่หน้าแดชบอร์ดหลักของ n8n</w:t>
       </w:r>
     </w:p>
     <w:tbl>
@@ -1339,7 +1324,7 @@
           <w:sz w:val="28"/>
           <w:rFonts w:ascii="TH Sarabun New" w:hAnsi="TH Sarabun New" w:cs="TH Sarabun New"/>
         </w:rPr>
-        <w:t>(คำอธิบายรูป: หน้าจอเข้าสู่ระบบ n8n สำหรับกรอกอีเมลและรหัสผ่านของผู้ดูแลระบบ)</w:t>
+        <w:t>(คำอธิบายรูป: ภาพหน้าจอ Login ของ n8n สำหรับให้ผู้ดูแลระบบกรอกอีเมลและรหัสผ่านเพื่อเข้าใช้งาน)</w:t>
       </w:r>
     </w:p>
     <w:p>
@@ -1375,7 +1360,7 @@
           <w:sz w:val="32"/>
           <w:rFonts w:ascii="TH Sarabun New" w:hAnsi="TH Sarabun New" w:cs="TH Sarabun New"/>
         </w:rPr>
-        <w:t>เมื่อเข้าสู่ระบบแล้ว ให้เลือกเวิร์กโฟลว์ “Rice Leaf Disease Diagnosis Bot” หน้าจอจะแสดงขั้นตอนการทำงานของระบบที่เชื่อมต่อกันเป็นผังงาน (Canvas) ได้แก่:</w:t>
+        <w:t>เมื่อเข้าสู่ระบบแล้ว ให้เลือกเวิร์กโฟลว์ “Rice Disease LINE Chatbot” หน้าจอจะแสดงขั้นตอนการทำงานของระบบที่เชื่อมต่อกันเป็นผังงาน (Canvas) ได้แก่:</w:t>
       </w:r>
     </w:p>
     <w:p>
@@ -1393,7 +1378,7 @@
           <w:sz w:val="32"/>
           <w:rFonts w:ascii="TH Sarabun New" w:hAnsi="TH Sarabun New" w:cs="TH Sarabun New"/>
         </w:rPr>
-        <w:t>1) โหนดรับข้อมูลจาก LINE (LINE Webhook): ทำหน้าที่รับรูปภาพและข้อความที่ผู้ใช้ส่งเข้ามา</w:t>
+        <w:t>1) LINE Webhook Node: ทำหน้าที่รับข้อมูลรูปภาพและข้อความที่ผู้ใช้ส่งเข้ามาจาก LINE</w:t>
       </w:r>
     </w:p>
     <w:p>
@@ -1411,7 +1396,7 @@
           <w:sz w:val="32"/>
           <w:rFonts w:ascii="TH Sarabun New" w:hAnsi="TH Sarabun New" w:cs="TH Sarabun New"/>
         </w:rPr>
-        <w:t>2) โหนดแยกประเภท (Router): คัดแยกว่าเป็นรูปภาพหรือข้อความ</w:t>
+        <w:t>2) Router Node: ทำหน้าที่คัดแยกว่าข้อมูลที่ส่งเข้ามาเป็นรูปภาพหรือข้อความพิมพ์สอบถาม</w:t>
       </w:r>
     </w:p>
     <w:p>
@@ -1429,7 +1414,7 @@
           <w:sz w:val="32"/>
           <w:rFonts w:ascii="TH Sarabun New" w:hAnsi="TH Sarabun New" w:cs="TH Sarabun New"/>
         </w:rPr>
-        <w:t>3) โหนดเรียกโมเดล AI (Model API): ส่งรูปไปให้โมเดลตรวจจับโรคข้าว</w:t>
+        <w:t>3) HTTP Request Node (Model API): เชื่อมต่อไปยังเซิร์ฟเวอร์ AI เพื่อส่งภาพไปให้โมเดล RT-DETR-L v5 ตรวจจับรอยโรค</w:t>
       </w:r>
     </w:p>
     <w:p>
@@ -1447,7 +1432,7 @@
           <w:sz w:val="32"/>
           <w:rFonts w:ascii="TH Sarabun New" w:hAnsi="TH Sarabun New" w:cs="TH Sarabun New"/>
         </w:rPr>
-        <w:t>4) โหนดค้นหาข้อมูล (Pinecone Vector Search): ค้นหาวิธีรักษาโรคข้าวจากฐานข้อมูล</w:t>
+        <w:t>4) Pinecone Vector Search Node: เชื่อมต่อค้นหาข้อมูลวิธีการรักษาโรคข้าวจากดัชนีฐานข้อมูล</w:t>
       </w:r>
     </w:p>
     <w:p>
@@ -1465,7 +1450,7 @@
           <w:sz w:val="32"/>
           <w:rFonts w:ascii="TH Sarabun New" w:hAnsi="TH Sarabun New" w:cs="TH Sarabun New"/>
         </w:rPr>
-        <w:t>5) โหนดสร้างคำตอบ (Google Gemini): เรียบเรียงคำแนะนำให้อ่านเข้าใจง่าย</w:t>
+        <w:t>5) Google Gemini 2.5 Flash Node: เรียบเรียงคำตอบและคำแนะนำการรักษาให้อ่านเข้าใจง่าย</w:t>
       </w:r>
     </w:p>
     <w:p>
@@ -1483,7 +1468,7 @@
           <w:sz w:val="32"/>
           <w:rFonts w:ascii="TH Sarabun New" w:hAnsi="TH Sarabun New" w:cs="TH Sarabun New"/>
         </w:rPr>
-        <w:t>6) โหนดส่งข้อความตอบกลับ (LINE Reply): ส่งผลลัพธ์กลับไปที่แชทของผู้ใช้ (หมายเหตุ: ต้องตรวจดูสวิตช์มุมขวาบนให้เปิดเป็น “Active” เพื่อให้ระบบทำงานตลอดเวลา)</w:t>
+        <w:t>6) LINE Reply (Text RAG) Node: ส่งข้อความตอบกลับไปยังห้องแชท LINE ของผู้ใช้งาน (หมายเหตุ: ผู้ดูแลระบบต้องตรวจดูสวิตช์มุมขวาบนให้เปิดเป็น “Active” เสมอ เพื่อให้ระบบทำงานได้ตลอด 24 ชั่วโมง)</w:t>
       </w:r>
     </w:p>
     <w:tbl>
@@ -1564,7 +1549,7 @@
           <w:sz w:val="32"/>
           <w:rFonts w:ascii="TH Sarabun New" w:hAnsi="TH Sarabun New" w:cs="TH Sarabun New"/>
         </w:rPr>
-        <w:t>หน้าจอผังการทำงานของแชทบอทบน n8n</w:t>
+        <w:t>หน้าจอผังการทำงานของแชทบอท (Workflow Canvas) บนระบบ n8n</w:t>
       </w:r>
     </w:p>
     <w:p>
@@ -1581,7 +1566,7 @@
           <w:sz w:val="28"/>
           <w:rFonts w:ascii="TH Sarabun New" w:hAnsi="TH Sarabun New" w:cs="TH Sarabun New"/>
         </w:rPr>
-        <w:t>(คำอธิบายรูป: หน้าจอแสดงโหนดการทำงานต่าง ๆ ของระบบแชทบอทที่เชื่อมต่อกันบน n8n)</w:t>
+        <w:t>(คำอธิบายรูป: ภาพหน้าจอผังการเชื่อมต่อโหนดต่าง ๆ บน n8n แสดงเส้นทางการรับส่งข้อมูลตั้งแต่ Webhook จนถึงการส่งข้อความตอบกลับ)</w:t>
       </w:r>
     </w:p>
     <w:p>
@@ -1599,7 +1584,7 @@
           <w:sz w:val="32"/>
           <w:rFonts w:ascii="TH Sarabun New" w:hAnsi="TH Sarabun New" w:cs="TH Sarabun New"/>
         </w:rPr>
-        <w:t>ก.2.3 การดูประวัติการใช้งานและข้อผิดพลาด (Execution Logs)</w:t>
+        <w:t>ก.2.3 การดูประวัติการใช้งานและตรวจสอบข้อมูลเชิงลึก (Execution Logs)</w:t>
       </w:r>
     </w:p>
     <w:p>
@@ -1617,7 +1602,7 @@
           <w:sz w:val="32"/>
           <w:rFonts w:ascii="TH Sarabun New" w:hAnsi="TH Sarabun New" w:cs="TH Sarabun New"/>
         </w:rPr>
-        <w:t>ผู้ดูแลระบบสามารถตรวจสอบการทำงานย้อนหลังของบอทได้ดังนี้:</w:t>
+        <w:t>ผู้ดูแลระบบสามารถตรวจสอบการทำงานย้อนหลังและการวิเคราะห์ปัญหา (Debugging) ได้ดังนี้:</w:t>
       </w:r>
     </w:p>
     <w:p>
@@ -1635,7 +1620,7 @@
           <w:sz w:val="32"/>
           <w:rFonts w:ascii="TH Sarabun New" w:hAnsi="TH Sarabun New" w:cs="TH Sarabun New"/>
         </w:rPr>
-        <w:t>1) คลิกที่เมนู “Executions” ทางแถบด้านซ้าย</w:t>
+        <w:t>1) คลิกที่แถบเมนู “Executions” ทางแถบด้านซ้ายของหน้าจอ</w:t>
       </w:r>
     </w:p>
     <w:p>
@@ -1653,7 +1638,7 @@
           <w:sz w:val="32"/>
           <w:rFonts w:ascii="TH Sarabun New" w:hAnsi="TH Sarabun New" w:cs="TH Sarabun New"/>
         </w:rPr>
-        <w:t>2) หน้าจอจะแสดงรายการที่เคยประมวลผลทั้งหมด พร้อมบอกเวลา สถานะว่าผ่านหรือไม่ (Success หรือ Error) และเวลาที่ใช้ไป</w:t>
+        <w:t>2) ระบบจะแสดงตารางรายการประวัติการเรียกใช้งานทั้งหมด พร้อมแสดงสถานะการทำงาน (Success / Error), เวลาที่เริ่มต้นทำงาน (Start time), และระยะเวลาที่ใช้ในการประมวลผล (Duration)</w:t>
       </w:r>
     </w:p>
     <w:p>
@@ -1671,7 +1656,7 @@
           <w:sz w:val="32"/>
           <w:rFonts w:ascii="TH Sarabun New" w:hAnsi="TH Sarabun New" w:cs="TH Sarabun New"/>
         </w:rPr>
-        <w:t>3) สามารถคลิกเข้าไปดูรายละเอียดของแต่ละรายการได้ว่า ผู้ใช้ส่งภาพหรือข้อความอะไรเข้ามา และแต่ละขั้นตอนประมวลผลได้ผลลัพธ์อย่างไร ช่วยให้ตรวจสอบและแก้ไขปัญหาได้ง่าย</w:t>
+        <w:t>3) เมื่อคลิกที่รายการใดรายการหนึ่ง หน้าจอจะแสดงรายละเอียดข้อมูลนำเข้าและส่งออก (Input / Output Payload) ของแต่ละโหนดอย่างละเอียด เช่น โหนด LINE Reply (Text RAG) จะแสดงข้อความคำถาม, รหัสโรค (disease_id), คำตอบที่ AI สร้างขึ้น, เอกสารบริบทที่ดึงมา (contexts) และรหัสยืนยันการส่งข้อความสำเร็จ (sentMessages ID)</w:t>
       </w:r>
     </w:p>
     <w:tbl>
@@ -1752,7 +1737,7 @@
           <w:sz w:val="32"/>
           <w:rFonts w:ascii="TH Sarabun New" w:hAnsi="TH Sarabun New" w:cs="TH Sarabun New"/>
         </w:rPr>
-        <w:t>หน้าจอแสดงประวัติการทำงาน (Executions) บน n8n</w:t>
+        <w:t>หน้าจอแสดงประวัติการทำงาน (Executions) และการตรวจสอบ Payload บน n8n</w:t>
       </w:r>
     </w:p>
     <w:p>
@@ -1769,7 +1754,7 @@
           <w:sz w:val="28"/>
           <w:rFonts w:ascii="TH Sarabun New" w:hAnsi="TH Sarabun New" w:cs="TH Sarabun New"/>
         </w:rPr>
-        <w:t>(คำอธิบายรูป: หน้าจอแสดงรายการประวัติการใช้งานย้อนหลัง และการกดดูข้อมูลในแต่ละโหนด)</w:t>
+        <w:t>(คำอธิบายรูป: ภาพหน้าจอแสดงประวัติการทำงานย้อนหลังในหน้า Executions และการคลิกดูรายละเอียด Payload ของแต่ละโหนด)</w:t>
       </w:r>
     </w:p>
     <w:p>
@@ -1787,7 +1772,7 @@
           <w:sz w:val="32"/>
           <w:rFonts w:ascii="TH Sarabun New" w:hAnsi="TH Sarabun New" w:cs="TH Sarabun New"/>
         </w:rPr>
-        <w:t>ก.2.4 การจัดการฐานข้อมูลความรู้ (Pinecone Vector Database)</w:t>
+        <w:t>ก.2.4 การจัดการฐานข้อมูลความรู้เวกเตอร์ (Pinecone Vector Database)</w:t>
       </w:r>
     </w:p>
     <w:p>
@@ -1805,7 +1790,7 @@
           <w:sz w:val="32"/>
           <w:rFonts w:ascii="TH Sarabun New" w:hAnsi="TH Sarabun New" w:cs="TH Sarabun New"/>
         </w:rPr>
-        <w:t>ผู้ดูแลระบบสามารถตรวจดูฐานข้อมูลความรู้โรคข้าวได้ตามขั้นตอนนี้:</w:t>
+        <w:t>ผู้ดูแลระบบสามารถตรวจสอบและจัดการดัชนีข้อมูลความรู้โรคข้าวได้ตามขั้นตอนนี้:</w:t>
       </w:r>
     </w:p>
     <w:p>
@@ -1823,7 +1808,7 @@
           <w:sz w:val="32"/>
           <w:rFonts w:ascii="TH Sarabun New" w:hAnsi="TH Sarabun New" w:cs="TH Sarabun New"/>
         </w:rPr>
-        <w:t>1) เข้าไปที่เว็บไซต์ Pinecone (https://app.pinecone.io) และลงชื่อเข้าใช้</w:t>
+        <w:t>1) เข้าสู่เว็บไซต์คอนโซลของ Pinecone (https://app.pinecone.io) และลงชื่อเข้าใช้</w:t>
       </w:r>
     </w:p>
     <w:p>
@@ -1841,7 +1826,7 @@
           <w:sz w:val="32"/>
           <w:rFonts w:ascii="TH Sarabun New" w:hAnsi="TH Sarabun New" w:cs="TH Sarabun New"/>
         </w:rPr>
-        <w:t>2) เลือกดู Index ประจำโครงงาน เช่น rice-disease-index</w:t>
+        <w:t>2) เลือกดูรายละเอียด Index ประจำโครงงาน ชื่อ rice-knowledge</w:t>
       </w:r>
     </w:p>
     <w:p>
@@ -1859,7 +1844,7 @@
           <w:sz w:val="32"/>
           <w:rFonts w:ascii="TH Sarabun New" w:hAnsi="TH Sarabun New" w:cs="TH Sarabun New"/>
         </w:rPr>
-        <w:t>3) ดูข้อมูลสำคัญ เช่น Total Vectors (จำนวนชิ้นข้อมูลความรู้ที่เก็บไว้ในระบบ), Dimension (ขนาดมิติของเวกเตอร์ เช่น 768 หรือ 1536) และสถิติการใช้งาน เช่น จำนวนครั้งที่มีการค้นหาข้อมูล</w:t>
+        <w:t>3) ตรวจสอบข้อมูลสถิติที่สำคัญ: Index Name: rice-knowledge (Type: Dense, Region: aws us-east-1), Record Count: จำนวนชิ้นข้อมูลความรู้โรคข้าว (Chunks) ที่จัดเก็บอยู่ในระบบ (เช่น 10 Chunks), Records: รายการข้อมูลความรู้ของแต่ละโรค เช่น bacterial_leaf_blight_chunk_0, leaf_blast_chunk_0, sheath_blight_chunk_0 และสถิติการใช้งาน เช่น จำนวนครั้งที่มีการค้นหาข้อมูล</w:t>
       </w:r>
     </w:p>
     <w:tbl>
@@ -1940,7 +1925,7 @@
           <w:sz w:val="32"/>
           <w:rFonts w:ascii="TH Sarabun New" w:hAnsi="TH Sarabun New" w:cs="TH Sarabun New"/>
         </w:rPr>
-        <w:t>หน้าจอจัดการฐานข้อมูลความรู้บน Pinecone</w:t>
+        <w:t>หน้าจอจัดการ Index rice-knowledge บน Pinecone Vector Database Console</w:t>
       </w:r>
     </w:p>
     <w:p>
@@ -1957,7 +1942,7 @@
           <w:sz w:val="28"/>
           <w:rFonts w:ascii="TH Sarabun New" w:hAnsi="TH Sarabun New" w:cs="TH Sarabun New"/>
         </w:rPr>
-        <w:t>(คำอธิบายรูป: หน้าจอแดชบอร์ด Pinecone แสดงข้อมูล Index และจำนวนข้อมูลที่จัดเก็บ)</w:t>
+        <w:t>(คำอธิบายรูป: ภาพหน้าจอแดชบอร์ดบนเว็บไซต์ Pinecone แสดงสถานะ Index จำนวนเวกเตอร์ และมิติข้อมูลของฐานความรู้โรคข้าว)</w:t>
       </w:r>
     </w:p>
     <w:p>
@@ -1975,7 +1960,7 @@
           <w:sz w:val="32"/>
           <w:rFonts w:ascii="TH Sarabun New" w:hAnsi="TH Sarabun New" w:cs="TH Sarabun New"/>
         </w:rPr>
-        <w:t>ก.2.5 การอัปเดตข้อมูลความรู้โรคข้าวเพิ่มเติม</w:t>
+        <w:t>ก.2.5 การอัปเดตและเพิ่มเอกสารความรู้โรคข้าว (Knowledge Ingestion Script)</w:t>
       </w:r>
     </w:p>
     <w:p>
@@ -1993,7 +1978,7 @@
           <w:sz w:val="32"/>
           <w:rFonts w:ascii="TH Sarabun New" w:hAnsi="TH Sarabun New" w:cs="TH Sarabun New"/>
         </w:rPr>
-        <w:t>หากมีข้อมูลโรคข้าวใหม่ หรือมีคู่มือวิชาการฉบับใหม่จากกรมการข้าว สามารถเพิ่มเข้าสู่ระบบได้ดังนี้:</w:t>
+        <w:t>กรณีที่มีข้อมูลโรคข้าวใหม่ สารเคมีชนิดใหม่ หรือต้องการอัปเดตคู่มือวิชาการของกรมการข้าว ผู้ดูแลระบบสามารถเพิ่มข้อมูลเข้าสู่ระบบได้ดังนี้:</w:t>
       </w:r>
     </w:p>
     <w:p>
@@ -2011,7 +1996,7 @@
           <w:sz w:val="32"/>
           <w:rFonts w:ascii="TH Sarabun New" w:hAnsi="TH Sarabun New" w:cs="TH Sarabun New"/>
         </w:rPr>
-        <w:t>1) นำไฟล์เอกสารฉบับใหม่ (ไฟล์ .pdf หรือ .txt) ไปวางไว้ในโฟลเดอร์ data/knowledge_base/</w:t>
+        <w:t>1) นำไฟล์เอกสารคู่มือฉบับใหม่ (ไฟล์ .pdf, .md หรือ .txt) ไปจัดเก็บไว้ในโฟลเดอร์คลังเอกสารของระบบ (data/knowledge_base/)</w:t>
       </w:r>
     </w:p>
     <w:p>
@@ -2029,7 +2014,7 @@
           <w:sz w:val="32"/>
           <w:rFonts w:ascii="TH Sarabun New" w:hAnsi="TH Sarabun New" w:cs="TH Sarabun New"/>
         </w:rPr>
-        <w:t>2) เปิดโปรแกรม Terminal หรือ Command Prompt</w:t>
+        <w:t>2) เปิดโปรแกรม Terminal หรือ Command Prompt ในเครื่องเซิร์ฟเวอร์</w:t>
       </w:r>
     </w:p>
     <w:p>
@@ -2047,7 +2032,7 @@
           <w:sz w:val="32"/>
           <w:rFonts w:ascii="TH Sarabun New" w:hAnsi="TH Sarabun New" w:cs="TH Sarabun New"/>
         </w:rPr>
-        <w:t>3) พิมพ์คำสั่งรันสคริปต์: python scripts/ingest_knowledge.py</w:t>
+        <w:t>3) รันคำสั่งสคริปต์สำหรับการนำเข้าข้อมูลความรู้: python scripts/ingest_knowledge.py</w:t>
       </w:r>
     </w:p>
     <w:p>
@@ -2065,7 +2050,7 @@
           <w:sz w:val="32"/>
           <w:rFonts w:ascii="TH Sarabun New" w:hAnsi="TH Sarabun New" w:cs="TH Sarabun New"/>
         </w:rPr>
-        <w:t>4) ระบบจะอ่านเอกสาร ตัดแบ่งข้อความ และแปลงเป็นข้อมูลเวกเตอร์อัปโหลดเข้า Pinecone ให้โดยอัตโนมัติ ทำให้บอทสามารถนำข้อมูลใหม่ไปใช้ตอบคำถามผู้ใช้ได้ทันที</w:t>
+        <w:t>4) สคริปต์จะทำการอ่านเอกสาร ตัดแบ่งข้อความออกเป็นส่วนย่อย (Chunking), คำนวณค่า Vector Embeddings และอัปโหลดเวกเตอร์ชุดใหม่เข้าสู่ Pinecone Index rice-knowledge โดยอัตโนมัติ ทำให้บอทสามารถนำข้อมูลความรู้ใหม่มาใช้ตอบคำถามแก่เกษตรกรได้ทันทีโดยไม่ต้องทำการเทรนโมเดลใหม่</w:t>
       </w:r>
     </w:p>
     <w:tbl>
@@ -2146,7 +2131,7 @@
           <w:sz w:val="32"/>
           <w:rFonts w:ascii="TH Sarabun New" w:hAnsi="TH Sarabun New" w:cs="TH Sarabun New"/>
         </w:rPr>
-        <w:t>การรันคำสั่งอัปเดตข้อมูลความรู้โรคข้าว</w:t>
+        <w:t>หน้าต่างการรันสคริปต์อัปเดตเอกสารความรู้โรคข้าวเข้าสู่ Vector Database</w:t>
       </w:r>
     </w:p>
     <w:p>
@@ -2163,7 +2148,7 @@
           <w:sz w:val="28"/>
           <w:rFonts w:ascii="TH Sarabun New" w:hAnsi="TH Sarabun New" w:cs="TH Sarabun New"/>
         </w:rPr>
-        <w:t>(คำอธิบายรูป: หน้าต่าง Terminal ตอนรันคำสั่งเพิ่มข้อมูลคู่มือโรคข้าวเข้าสู่ฐานข้อมูล)</w:t>
+        <w:t>(คำอธิบายรูป: ภาพหน้าจอ Terminal ขณะรันสคริปต์ Ingestion แสดงขั้นตอนการอ่านไฟล์เอกสาร การทำ Chunking และการอัปโหลดเวกเตอร์ขึ้น Pinecone สำเร็จ)</w:t>
       </w:r>
     </w:p>
     <w:sectPr>

</xml_diff>